<commit_message>
Thesis V3: expanded content, numbered sections, TOC matching reference, embedded plots, logo
</commit_message>
<xml_diff>
--- a/data/SmartClaim_AI_Thesis.docx
+++ b/data/SmartClaim_AI_Thesis.docx
@@ -3,9 +3,6 @@
 <w:document xmlns:wpc="http://schemas.microsoft.com/office/word/2010/wordprocessingCanvas" xmlns:mo="http://schemas.microsoft.com/office/mac/office/2008/main" xmlns:mc="http://schemas.openxmlformats.org/markup-compatibility/2006" xmlns:mv="urn:schemas-microsoft-com:mac:vml" xmlns:o="urn:schemas-microsoft-com:office:office" xmlns:r="http://schemas.openxmlformats.org/officeDocument/2006/relationships" xmlns:m="http://schemas.openxmlformats.org/officeDocument/2006/math" xmlns:v="urn:schemas-microsoft-com:vml" xmlns:wp14="http://schemas.microsoft.com/office/word/2010/wordprocessingDrawing" xmlns:wp="http://schemas.openxmlformats.org/drawingml/2006/wordprocessingDrawing" xmlns:w10="urn:schemas-microsoft-com:office:word" xmlns:w="http://schemas.openxmlformats.org/wordprocessingml/2006/main" xmlns:w14="http://schemas.microsoft.com/office/word/2010/wordml" xmlns:wpg="http://schemas.microsoft.com/office/word/2010/wordprocessingGroup" xmlns:wpi="http://schemas.microsoft.com/office/word/2010/wordprocessingInk" xmlns:wne="http://schemas.microsoft.com/office/word/2006/wordml" xmlns:wps="http://schemas.microsoft.com/office/word/2010/wordprocessingShape" mc:Ignorable="w14 wp14">
   <w:body>
     <w:p>
-      <w:pPr>
-        <w:jc w:val="left"/>
-      </w:pPr>
       <w:r>
         <w:drawing>
           <wp:inline xmlns:a="http://schemas.openxmlformats.org/drawingml/2006/main" xmlns:pic="http://schemas.openxmlformats.org/drawingml/2006/picture">
@@ -74,36 +71,22 @@
     <w:p/>
     <w:p/>
     <w:p>
-      <w:pPr>
-        <w:jc w:val="left"/>
-      </w:pPr>
       <w:r>
         <w:rPr>
-          <w:rFonts w:ascii="Calibri" w:hAnsi="Calibri"/>
           <w:sz w:val="28"/>
         </w:rPr>
         <w:t>Ra'ana Hatim Shaikh</w:t>
       </w:r>
     </w:p>
     <w:p>
-      <w:pPr>
-        <w:jc w:val="left"/>
-      </w:pPr>
       <w:r>
-        <w:rPr>
-          <w:rFonts w:ascii="Calibri" w:hAnsi="Calibri"/>
-        </w:rPr>
         <w:t>by:</w:t>
       </w:r>
     </w:p>
     <w:p/>
     <w:p>
-      <w:pPr>
-        <w:jc w:val="left"/>
-      </w:pPr>
       <w:r>
         <w:rPr>
-          <w:rFonts w:ascii="Calibri" w:hAnsi="Calibri"/>
           <w:sz w:val="28"/>
         </w:rPr>
         <w:t>A thesis submitted for the requirements of the degree of</w:t>
@@ -196,25 +179,15 @@
     <w:p/>
     <w:p/>
     <w:p>
-      <w:pPr>
-        <w:jc w:val="left"/>
-      </w:pPr>
       <w:r>
         <w:rPr>
-          <w:rFonts w:ascii="Calibri" w:hAnsi="Calibri"/>
           <w:sz w:val="28"/>
         </w:rPr>
         <w:t>Ra'ana Hatim Shaikh</w:t>
       </w:r>
     </w:p>
     <w:p>
-      <w:pPr>
-        <w:jc w:val="left"/>
-      </w:pPr>
       <w:r>
-        <w:rPr>
-          <w:rFonts w:ascii="Calibri" w:hAnsi="Calibri"/>
-        </w:rPr>
         <w:t>by:</w:t>
       </w:r>
     </w:p>
@@ -226,6 +199,7 @@
       <w:r>
         <w:rPr>
           <w:rFonts w:ascii="Calibri" w:hAnsi="Calibri"/>
+          <w:b w:val="0"/>
           <w:sz w:val="28"/>
         </w:rPr>
         <w:t>A thesis submitted for the requirements of the degree of</w:t>
@@ -241,6 +215,7 @@
       <w:r>
         <w:rPr>
           <w:rFonts w:ascii="Calibri" w:hAnsi="Calibri"/>
+          <w:b w:val="0"/>
           <w:sz w:val="28"/>
         </w:rPr>
         <w:t>Advisor:</w:t>
@@ -252,7 +227,6 @@
       </w:pPr>
       <w:r>
         <w:rPr>
-          <w:rFonts w:ascii="Calibri" w:hAnsi="Calibri"/>
           <w:b/>
           <w:sz w:val="28"/>
         </w:rPr>
@@ -271,9 +245,6 @@
       </w:pPr>
     </w:p>
     <w:p>
-      <w:pPr>
-        <w:jc w:val="left"/>
-      </w:pPr>
       <w:r>
         <w:drawing>
           <wp:inline xmlns:a="http://schemas.openxmlformats.org/drawingml/2006/main" xmlns:pic="http://schemas.openxmlformats.org/drawingml/2006/picture">
@@ -341,36 +312,22 @@
     <w:p/>
     <w:p/>
     <w:p>
-      <w:pPr>
-        <w:jc w:val="left"/>
-      </w:pPr>
       <w:r>
         <w:rPr>
-          <w:rFonts w:ascii="Calibri" w:hAnsi="Calibri"/>
           <w:sz w:val="28"/>
         </w:rPr>
         <w:t>Ra'ana Hatim Shaikh</w:t>
       </w:r>
     </w:p>
     <w:p>
-      <w:pPr>
-        <w:jc w:val="left"/>
-      </w:pPr>
       <w:r>
-        <w:rPr>
-          <w:rFonts w:ascii="Calibri" w:hAnsi="Calibri"/>
-        </w:rPr>
         <w:t>by:</w:t>
       </w:r>
     </w:p>
     <w:p/>
     <w:p>
-      <w:pPr>
-        <w:jc w:val="left"/>
-      </w:pPr>
       <w:r>
         <w:rPr>
-          <w:rFonts w:ascii="Calibri" w:hAnsi="Calibri"/>
           <w:sz w:val="28"/>
         </w:rPr>
         <w:t>A thesis submitted for the requirements of the degree of</w:t>
@@ -742,7 +699,6 @@
     </w:p>
     <w:p>
       <w:pPr>
-        <w:spacing w:before="240" w:after="240"/>
         <w:jc w:val="left"/>
       </w:pPr>
       <w:r>
@@ -783,13 +739,8 @@
       </w:pPr>
     </w:p>
     <w:p>
-      <w:pPr>
-        <w:spacing w:before="240" w:after="240"/>
-        <w:jc w:val="left"/>
-      </w:pPr>
       <w:r>
         <w:rPr>
-          <w:rFonts w:ascii="Calibri" w:hAnsi="Calibri"/>
           <w:b/>
           <w:sz w:val="50"/>
         </w:rPr>
@@ -889,7 +840,23 @@
           <w:i w:val="0"/>
           <w:sz w:val="24"/>
         </w:rPr>
-        <w:t>And to myself — to that version of me that refused to give up when the horizon felt impossibly narrow and refused to turn back when the weight grew heavy. This achievement is mine too — and with everything this work carries of effort, hope, and gratitude, I dedicate this work.</w:t>
+        <w:t>And to myself — to that version of me that refused to give up when the horizon felt impossibly narrow and refused to turn back when the weight grew heavy. To every late night spent in uncertainty, not knowing whether this would ever be finished — and to every moment of self-doubt that was met, somehow, with the decision to keep going anyway.</w:t>
+      </w:r>
+    </w:p>
+    <w:p>
+      <w:pPr>
+        <w:spacing w:after="160"/>
+        <w:ind w:left="1134"/>
+        <w:jc w:val="both"/>
+      </w:pPr>
+      <w:r>
+        <w:rPr>
+          <w:rFonts w:ascii="Calibri" w:hAnsi="Calibri"/>
+          <w:b w:val="0"/>
+          <w:i w:val="0"/>
+          <w:sz w:val="24"/>
+        </w:rPr>
+        <w:t>This achievement is mine too — and with everything this work carries of effort, hope, and gratitude, I dedicate this work.</w:t>
       </w:r>
     </w:p>
     <w:p>
@@ -904,13 +871,8 @@
       </w:pPr>
     </w:p>
     <w:p>
-      <w:pPr>
-        <w:spacing w:before="240" w:after="240"/>
-        <w:jc w:val="left"/>
-      </w:pPr>
       <w:r>
         <w:rPr>
-          <w:rFonts w:ascii="Calibri" w:hAnsi="Calibri"/>
           <w:b/>
           <w:sz w:val="50"/>
         </w:rPr>
@@ -946,7 +908,7 @@
           <w:i w:val="0"/>
           <w:sz w:val="24"/>
         </w:rPr>
-        <w:t>I would like to express my thanks and appreciation to my supervisor, Dr. Somayah Albaradei, whose guidance and follow-up supported this research at every stage and helped steer it in the right direction. Her commitment to the quality of this work was evident throughout.</w:t>
+        <w:t>No work of meaning is truly finished until its author acknowledges the hands that helped build it. Real effort is never made in isolation — it takes shape within a circle of generosity, guidance, and shared belief. It is therefore with deep sincerity that I extend my gratitude to everyone who played a part in this research journey.</w:t>
       </w:r>
     </w:p>
     <w:p>
@@ -962,7 +924,7 @@
           <w:i w:val="0"/>
           <w:sz w:val="24"/>
         </w:rPr>
-        <w:t>I am also deeply grateful to my professors and faculty members who accompanied my academic journey from its very beginning. What I learned in those classrooms was never simply information to be memorised and forgotten — it was an intellectual and academic foundation built steadily, year after year, until it bore its fruit in this very research.</w:t>
+        <w:t>I would like to express my thanks and appreciation to my supervisor, Dr. Somayah Albaradei, whose guidance and follow-up supported this research at every stage and helped steer it in the right direction. Her commitment to the quality of this work was evident throughout, and I ask God to reward her for her knowledge and effort.</w:t>
       </w:r>
     </w:p>
     <w:p>
@@ -978,7 +940,23 @@
           <w:i w:val="0"/>
           <w:sz w:val="24"/>
         </w:rPr>
-        <w:t>My thanks would not be complete without mentioning my dear colleagues, who shared this journey with me in all its detail — the difficult moments we faced together, and the happy milestones we celebrated side by side.</w:t>
+        <w:t>I am also deeply grateful to my professors and faculty members who accompanied my academic journey from its very beginning. What I learned in those classrooms was never simply information to be memorised and forgotten — it was an intellectual and academic foundation built steadily, year after year, until it bore its fruit in this very research. Every lesson delivered with sincerity, every discussion that sparked new thinking, and every observation that opened a new horizon — all of it became part of the foundation upon which this work was built.</w:t>
+      </w:r>
+    </w:p>
+    <w:p>
+      <w:pPr>
+        <w:spacing w:after="160"/>
+        <w:ind w:left="1134"/>
+        <w:jc w:val="both"/>
+      </w:pPr>
+      <w:r>
+        <w:rPr>
+          <w:rFonts w:ascii="Calibri" w:hAnsi="Calibri"/>
+          <w:b w:val="0"/>
+          <w:i w:val="0"/>
+          <w:sz w:val="24"/>
+        </w:rPr>
+        <w:t>My thanks would not be complete without mentioning my dear colleagues, who shared this journey with me in all its detail — the difficult moments we faced together, and the happy milestones we celebrated side by side. Their company was a breath of relief amid the pressure, a source of energy in times of exhaustion, and a collection of memories that will endure long after these pages are closed.</w:t>
       </w:r>
     </w:p>
     <w:p>
@@ -1025,13 +1003,8 @@
       </w:pPr>
     </w:p>
     <w:p>
-      <w:pPr>
-        <w:spacing w:before="240" w:after="240"/>
-        <w:jc w:val="left"/>
-      </w:pPr>
       <w:r>
         <w:rPr>
-          <w:rFonts w:ascii="Calibri" w:hAnsi="Calibri"/>
           <w:b/>
           <w:sz w:val="50"/>
         </w:rPr>
@@ -1051,7 +1024,7 @@
           <w:i w:val="0"/>
           <w:sz w:val="24"/>
         </w:rPr>
-        <w:t>Vehicle accident cost estimation is a fundamental operation in the Saudi insurance industry, yet current practices remain heavily dependent on manual expert assessments that are time-consuming, subjective, and difficult to scale. This project, SmartClaim AI, develops an intelligent hybrid pipeline that combines Transformer-based natural language processing, ensemble machine learning regression, and a domain-calibrated expert rule engine to automate vehicle repair cost prediction from Arabic accident descriptions.</w:t>
+        <w:t>Vehicle accident cost estimation is a fundamental operation in the Saudi insurance industry, yet current practices remain heavily dependent on manual expert assessments that are inherently time-consuming, subjective, and difficult to scale. The reliance on human inspectors to interpret Arabic-language accident reports and assign repair cost estimates introduces variability and delays across the claims processing pipeline. Therefore, this project, SmartClaim AI, aims to develop an intelligent hybrid pipeline that combines Transformer-based natural language processing, ensemble machine learning regression, and a domain-calibrated expert rule engine to automate and enhance the accuracy of vehicle repair cost prediction from Arabic accident descriptions.</w:t>
       </w:r>
     </w:p>
     <w:p>
@@ -1067,7 +1040,7 @@
           <w:i w:val="0"/>
           <w:sz w:val="24"/>
         </w:rPr>
-        <w:t>The system utilizes a multilingual Sentence Transformer model (paraphrase-multilingual-mpnet-base-v2) to generate 768-dimensional semantic embeddings from Arabic text, concatenated with six structured features from a custom Arabic NLP engine, producing a 774-dimensional hybrid feature vector. Multiple regression models are trained and the best is selected based on lowest mean absolute error.</w:t>
+        <w:t>The proposed system utilizes a multilingual Sentence Transformer model (paraphrase-multilingual-mpnet-base-v2) to generate 768-dimensional semantic embeddings from Arabic text inputs, which are then concatenated with six structured features extracted by a custom Arabic natural language processing engine, producing a 774-dimensional hybrid feature vector. Multiple regression models, including Random Forest and XGBoost, are trained and compared using randomized hyperparameter search with cross-validation, and the best-performing model is automatically selected based on the lowest mean absolute error on a held-out validation set.</w:t>
       </w:r>
     </w:p>
     <w:p>
@@ -1083,7 +1056,23 @@
           <w:i w:val="0"/>
           <w:sz w:val="24"/>
         </w:rPr>
-        <w:t>A critical innovation is the seven-tier Expert Cost Engine that post-processes ML predictions by constraining them within domain-calibrated Saudi Riyal ranges, achieving a 141-fold dynamic range (311 SAR to 43,946 SAR) and a 47-fold improvement in prediction granularity compared to the baseline.</w:t>
+        <w:t>A critical innovation of the system is the integration of a seven-tier Expert Cost Engine that post-processes the raw machine learning predictions by constraining them within domain-calibrated Saudi Riyal ranges. This expert layer addresses the fundamental bucketing bias problem observed in pure machine learning approaches, where the model collapses diverse damage scenarios into a narrow band of similar predictions. Through expert steering, the system achieves a 141-fold dynamic range (311 SAR to 43,946 SAR) and a 47-fold improvement in prediction granularity compared to the baseline machine learning output.</w:t>
+      </w:r>
+    </w:p>
+    <w:p>
+      <w:pPr>
+        <w:spacing w:after="160"/>
+        <w:ind w:left="1134"/>
+        <w:jc w:val="both"/>
+      </w:pPr>
+      <w:r>
+        <w:rPr>
+          <w:rFonts w:ascii="Calibri" w:hAnsi="Calibri"/>
+          <w:b w:val="0"/>
+          <w:i w:val="0"/>
+          <w:sz w:val="24"/>
+        </w:rPr>
+        <w:t>This project highlights the potential of integrating modern artificial intelligence technologies with domain-specific expert knowledge for insurance automation and demonstrates how hybrid intelligent systems can contribute to more accurate, consistent, and scalable claims processing in the Saudi automotive insurance sector.</w:t>
       </w:r>
     </w:p>
     <w:p>
@@ -1114,13 +1103,8 @@
       </w:pPr>
     </w:p>
     <w:p>
-      <w:pPr>
-        <w:spacing w:before="240" w:after="240"/>
-        <w:jc w:val="left"/>
-      </w:pPr>
       <w:r>
         <w:rPr>
-          <w:rFonts w:ascii="Calibri" w:hAnsi="Calibri"/>
           <w:b/>
           <w:sz w:val="50"/>
         </w:rPr>
@@ -1129,7 +1113,8 @@
     </w:p>
     <w:p>
       <w:pPr>
-        <w:spacing w:after="20"/>
+        <w:spacing w:after="40"/>
+        <w:ind w:left="0"/>
         <w:jc w:val="left"/>
       </w:pPr>
       <w:r>
@@ -1142,7 +1127,8 @@
     </w:p>
     <w:p>
       <w:pPr>
-        <w:spacing w:after="20"/>
+        <w:spacing w:after="40"/>
+        <w:ind w:left="0"/>
         <w:jc w:val="left"/>
       </w:pPr>
       <w:r>
@@ -1155,7 +1141,8 @@
     </w:p>
     <w:p>
       <w:pPr>
-        <w:spacing w:after="20"/>
+        <w:spacing w:after="40"/>
+        <w:ind w:left="0"/>
         <w:jc w:val="left"/>
       </w:pPr>
       <w:r>
@@ -1168,7 +1155,8 @@
     </w:p>
     <w:p>
       <w:pPr>
-        <w:spacing w:after="20"/>
+        <w:spacing w:after="40"/>
+        <w:ind w:left="0"/>
         <w:jc w:val="left"/>
       </w:pPr>
       <w:r>
@@ -1181,7 +1169,8 @@
     </w:p>
     <w:p>
       <w:pPr>
-        <w:spacing w:after="20"/>
+        <w:spacing w:after="40"/>
+        <w:ind w:left="0"/>
         <w:jc w:val="left"/>
       </w:pPr>
       <w:r>
@@ -1194,7 +1183,8 @@
     </w:p>
     <w:p>
       <w:pPr>
-        <w:spacing w:after="20"/>
+        <w:spacing w:after="40"/>
+        <w:ind w:left="0"/>
         <w:jc w:val="left"/>
       </w:pPr>
       <w:r>
@@ -1207,7 +1197,8 @@
     </w:p>
     <w:p>
       <w:pPr>
-        <w:spacing w:after="20"/>
+        <w:spacing w:after="40"/>
+        <w:ind w:left="0"/>
         <w:jc w:val="left"/>
       </w:pPr>
       <w:r>
@@ -1220,7 +1211,8 @@
     </w:p>
     <w:p>
       <w:pPr>
-        <w:spacing w:after="20"/>
+        <w:spacing w:after="40"/>
+        <w:ind w:left="850"/>
         <w:jc w:val="left"/>
       </w:pPr>
       <w:r>
@@ -1228,12 +1220,13 @@
           <w:rFonts w:ascii="Calibri" w:hAnsi="Calibri"/>
           <w:sz w:val="24"/>
         </w:rPr>
-        <w:t xml:space="preserve">    Problem Definition and Background</w:t>
+        <w:t>1.1 Problem Definition and Background</w:t>
       </w:r>
     </w:p>
     <w:p>
       <w:pPr>
-        <w:spacing w:after="20"/>
+        <w:spacing w:after="40"/>
+        <w:ind w:left="850"/>
         <w:jc w:val="left"/>
       </w:pPr>
       <w:r>
@@ -1241,12 +1234,13 @@
           <w:rFonts w:ascii="Calibri" w:hAnsi="Calibri"/>
           <w:sz w:val="24"/>
         </w:rPr>
-        <w:t xml:space="preserve">    Problem Objectives and Scope</w:t>
+        <w:t>1.2 Problem Objectives and Scope</w:t>
       </w:r>
     </w:p>
     <w:p>
       <w:pPr>
-        <w:spacing w:after="20"/>
+        <w:spacing w:after="40"/>
+        <w:ind w:left="1701"/>
         <w:jc w:val="left"/>
       </w:pPr>
       <w:r>
@@ -1254,12 +1248,13 @@
           <w:rFonts w:ascii="Calibri" w:hAnsi="Calibri"/>
           <w:sz w:val="24"/>
         </w:rPr>
-        <w:t xml:space="preserve">    Project Goal</w:t>
+        <w:t>1.2.1 Project Goal</w:t>
       </w:r>
     </w:p>
     <w:p>
       <w:pPr>
-        <w:spacing w:after="20"/>
+        <w:spacing w:after="40"/>
+        <w:ind w:left="1701"/>
         <w:jc w:val="left"/>
       </w:pPr>
       <w:r>
@@ -1267,12 +1262,13 @@
           <w:rFonts w:ascii="Calibri" w:hAnsi="Calibri"/>
           <w:sz w:val="24"/>
         </w:rPr>
-        <w:t xml:space="preserve">    Project Objectives</w:t>
+        <w:t>1.2.2 Project Objectives</w:t>
       </w:r>
     </w:p>
     <w:p>
       <w:pPr>
-        <w:spacing w:after="20"/>
+        <w:spacing w:after="40"/>
+        <w:ind w:left="850"/>
         <w:jc w:val="left"/>
       </w:pPr>
       <w:r>
@@ -1280,12 +1276,13 @@
           <w:rFonts w:ascii="Calibri" w:hAnsi="Calibri"/>
           <w:sz w:val="24"/>
         </w:rPr>
-        <w:t xml:space="preserve">    Relevance and Significance</w:t>
+        <w:t>1.3 Relevance and Significance</w:t>
       </w:r>
     </w:p>
     <w:p>
       <w:pPr>
-        <w:spacing w:after="20"/>
+        <w:spacing w:after="40"/>
+        <w:ind w:left="0"/>
         <w:jc w:val="left"/>
       </w:pPr>
       <w:r>
@@ -1298,7 +1295,8 @@
     </w:p>
     <w:p>
       <w:pPr>
-        <w:spacing w:after="20"/>
+        <w:spacing w:after="40"/>
+        <w:ind w:left="850"/>
         <w:jc w:val="left"/>
       </w:pPr>
       <w:r>
@@ -1306,12 +1304,13 @@
           <w:rFonts w:ascii="Calibri" w:hAnsi="Calibri"/>
           <w:sz w:val="24"/>
         </w:rPr>
-        <w:t xml:space="preserve">    Overview of Related Work</w:t>
+        <w:t>2.1 Overview of Related Work</w:t>
       </w:r>
     </w:p>
     <w:p>
       <w:pPr>
-        <w:spacing w:after="20"/>
+        <w:spacing w:after="40"/>
+        <w:ind w:left="850"/>
         <w:jc w:val="left"/>
       </w:pPr>
       <w:r>
@@ -1319,12 +1318,13 @@
           <w:rFonts w:ascii="Calibri" w:hAnsi="Calibri"/>
           <w:sz w:val="24"/>
         </w:rPr>
-        <w:t xml:space="preserve">    Summary of Related Works</w:t>
+        <w:t>2.2 Summary of Related Works</w:t>
       </w:r>
     </w:p>
     <w:p>
       <w:pPr>
-        <w:spacing w:after="20"/>
+        <w:spacing w:after="40"/>
+        <w:ind w:left="850"/>
         <w:jc w:val="left"/>
       </w:pPr>
       <w:r>
@@ -1332,12 +1332,13 @@
           <w:rFonts w:ascii="Calibri" w:hAnsi="Calibri"/>
           <w:sz w:val="24"/>
         </w:rPr>
-        <w:t xml:space="preserve">    Comparison of Related Works</w:t>
+        <w:t>2.3 Comparison of Related Works</w:t>
       </w:r>
     </w:p>
     <w:p>
       <w:pPr>
-        <w:spacing w:after="20"/>
+        <w:spacing w:after="40"/>
+        <w:ind w:left="850"/>
         <w:jc w:val="left"/>
       </w:pPr>
       <w:r>
@@ -1345,12 +1346,13 @@
           <w:rFonts w:ascii="Calibri" w:hAnsi="Calibri"/>
           <w:sz w:val="24"/>
         </w:rPr>
-        <w:t xml:space="preserve">    Research Gap</w:t>
+        <w:t>2.4 Research Gap</w:t>
       </w:r>
     </w:p>
     <w:p>
       <w:pPr>
-        <w:spacing w:after="20"/>
+        <w:spacing w:after="40"/>
+        <w:ind w:left="0"/>
         <w:jc w:val="left"/>
       </w:pPr>
       <w:r>
@@ -1363,7 +1365,8 @@
     </w:p>
     <w:p>
       <w:pPr>
-        <w:spacing w:after="20"/>
+        <w:spacing w:after="40"/>
+        <w:ind w:left="850"/>
         <w:jc w:val="left"/>
       </w:pPr>
       <w:r>
@@ -1371,12 +1374,13 @@
           <w:rFonts w:ascii="Calibri" w:hAnsi="Calibri"/>
           <w:sz w:val="24"/>
         </w:rPr>
-        <w:t xml:space="preserve">    Data Collection</w:t>
+        <w:t>3.1 Data Collection</w:t>
       </w:r>
     </w:p>
     <w:p>
       <w:pPr>
-        <w:spacing w:after="20"/>
+        <w:spacing w:after="40"/>
+        <w:ind w:left="850"/>
         <w:jc w:val="left"/>
       </w:pPr>
       <w:r>
@@ -1384,12 +1388,13 @@
           <w:rFonts w:ascii="Calibri" w:hAnsi="Calibri"/>
           <w:sz w:val="24"/>
         </w:rPr>
-        <w:t xml:space="preserve">    Preprocessing</w:t>
+        <w:t>3.2 Preprocessing</w:t>
       </w:r>
     </w:p>
     <w:p>
       <w:pPr>
-        <w:spacing w:after="20"/>
+        <w:spacing w:after="40"/>
+        <w:ind w:left="1701"/>
         <w:jc w:val="left"/>
       </w:pPr>
       <w:r>
@@ -1397,12 +1402,13 @@
           <w:rFonts w:ascii="Calibri" w:hAnsi="Calibri"/>
           <w:sz w:val="24"/>
         </w:rPr>
-        <w:t xml:space="preserve">    Feature Engineering</w:t>
+        <w:t>3.2.1 Data Cleaning</w:t>
       </w:r>
     </w:p>
     <w:p>
       <w:pPr>
-        <w:spacing w:after="20"/>
+        <w:spacing w:after="40"/>
+        <w:ind w:left="1701"/>
         <w:jc w:val="left"/>
       </w:pPr>
       <w:r>
@@ -1410,12 +1416,13 @@
           <w:rFonts w:ascii="Calibri" w:hAnsi="Calibri"/>
           <w:sz w:val="24"/>
         </w:rPr>
-        <w:t xml:space="preserve">    Embedding Generation</w:t>
+        <w:t>3.2.2 Data Splitting</w:t>
       </w:r>
     </w:p>
     <w:p>
       <w:pPr>
-        <w:spacing w:after="20"/>
+        <w:spacing w:after="40"/>
+        <w:ind w:left="850"/>
         <w:jc w:val="left"/>
       </w:pPr>
       <w:r>
@@ -1423,12 +1430,13 @@
           <w:rFonts w:ascii="Calibri" w:hAnsi="Calibri"/>
           <w:sz w:val="24"/>
         </w:rPr>
-        <w:t xml:space="preserve">    Model Training</w:t>
+        <w:t>3.3 Feature Engineering</w:t>
       </w:r>
     </w:p>
     <w:p>
       <w:pPr>
-        <w:spacing w:after="20"/>
+        <w:spacing w:after="40"/>
+        <w:ind w:left="850"/>
         <w:jc w:val="left"/>
       </w:pPr>
       <w:r>
@@ -1436,12 +1444,13 @@
           <w:rFonts w:ascii="Calibri" w:hAnsi="Calibri"/>
           <w:sz w:val="24"/>
         </w:rPr>
-        <w:t xml:space="preserve">    Expert Cost Engine</w:t>
+        <w:t>3.4 Embedding Generation</w:t>
       </w:r>
     </w:p>
     <w:p>
       <w:pPr>
-        <w:spacing w:after="20"/>
+        <w:spacing w:after="40"/>
+        <w:ind w:left="850"/>
         <w:jc w:val="left"/>
       </w:pPr>
       <w:r>
@@ -1449,12 +1458,41 @@
           <w:rFonts w:ascii="Calibri" w:hAnsi="Calibri"/>
           <w:sz w:val="24"/>
         </w:rPr>
-        <w:t xml:space="preserve">    Web Platform Implementation</w:t>
+        <w:t>3.5 Model Training</w:t>
       </w:r>
     </w:p>
     <w:p>
       <w:pPr>
-        <w:spacing w:after="20"/>
+        <w:spacing w:after="40"/>
+        <w:ind w:left="850"/>
+        <w:jc w:val="left"/>
+      </w:pPr>
+      <w:r>
+        <w:rPr>
+          <w:rFonts w:ascii="Calibri" w:hAnsi="Calibri"/>
+          <w:sz w:val="24"/>
+        </w:rPr>
+        <w:t>3.6 Expert Cost Engine</w:t>
+      </w:r>
+    </w:p>
+    <w:p>
+      <w:pPr>
+        <w:spacing w:after="40"/>
+        <w:ind w:left="850"/>
+        <w:jc w:val="left"/>
+      </w:pPr>
+      <w:r>
+        <w:rPr>
+          <w:rFonts w:ascii="Calibri" w:hAnsi="Calibri"/>
+          <w:sz w:val="24"/>
+        </w:rPr>
+        <w:t>3.7 Web Platform Implementation</w:t>
+      </w:r>
+    </w:p>
+    <w:p>
+      <w:pPr>
+        <w:spacing w:after="40"/>
+        <w:ind w:left="0"/>
         <w:jc w:val="left"/>
       </w:pPr>
       <w:r>
@@ -1467,7 +1505,8 @@
     </w:p>
     <w:p>
       <w:pPr>
-        <w:spacing w:after="20"/>
+        <w:spacing w:after="40"/>
+        <w:ind w:left="850"/>
         <w:jc w:val="left"/>
       </w:pPr>
       <w:r>
@@ -1475,12 +1514,13 @@
           <w:rFonts w:ascii="Calibri" w:hAnsi="Calibri"/>
           <w:sz w:val="24"/>
         </w:rPr>
-        <w:t xml:space="preserve">    Evaluation Metrics</w:t>
+        <w:t>4.1 Evaluation Metrics</w:t>
       </w:r>
     </w:p>
     <w:p>
       <w:pPr>
-        <w:spacing w:after="20"/>
+        <w:spacing w:after="40"/>
+        <w:ind w:left="850"/>
         <w:jc w:val="left"/>
       </w:pPr>
       <w:r>
@@ -1488,12 +1528,13 @@
           <w:rFonts w:ascii="Calibri" w:hAnsi="Calibri"/>
           <w:sz w:val="24"/>
         </w:rPr>
-        <w:t xml:space="preserve">    Model Comparison Results</w:t>
+        <w:t>4.2 Model Comparison Results</w:t>
       </w:r>
     </w:p>
     <w:p>
       <w:pPr>
-        <w:spacing w:after="20"/>
+        <w:spacing w:after="40"/>
+        <w:ind w:left="850"/>
         <w:jc w:val="left"/>
       </w:pPr>
       <w:r>
@@ -1501,12 +1542,13 @@
           <w:rFonts w:ascii="Calibri" w:hAnsi="Calibri"/>
           <w:sz w:val="24"/>
         </w:rPr>
-        <w:t xml:space="preserve">    Expert Engine Evaluation</w:t>
+        <w:t>4.3 Expert Engine Evaluation</w:t>
       </w:r>
     </w:p>
     <w:p>
       <w:pPr>
-        <w:spacing w:after="20"/>
+        <w:spacing w:after="40"/>
+        <w:ind w:left="850"/>
         <w:jc w:val="left"/>
       </w:pPr>
       <w:r>
@@ -1514,12 +1556,13 @@
           <w:rFonts w:ascii="Calibri" w:hAnsi="Calibri"/>
           <w:sz w:val="24"/>
         </w:rPr>
-        <w:t xml:space="preserve">    Web Platform Testing</w:t>
+        <w:t>4.4 Web Platform Functional Testing</w:t>
       </w:r>
     </w:p>
     <w:p>
       <w:pPr>
-        <w:spacing w:after="20"/>
+        <w:spacing w:after="40"/>
+        <w:ind w:left="0"/>
         <w:jc w:val="left"/>
       </w:pPr>
       <w:r>
@@ -1532,7 +1575,8 @@
     </w:p>
     <w:p>
       <w:pPr>
-        <w:spacing w:after="20"/>
+        <w:spacing w:after="40"/>
+        <w:ind w:left="850"/>
         <w:jc w:val="left"/>
       </w:pPr>
       <w:r>
@@ -1540,12 +1584,13 @@
           <w:rFonts w:ascii="Calibri" w:hAnsi="Calibri"/>
           <w:sz w:val="24"/>
         </w:rPr>
-        <w:t xml:space="preserve">    Key Findings</w:t>
+        <w:t>5.1 Key Findings</w:t>
       </w:r>
     </w:p>
     <w:p>
       <w:pPr>
-        <w:spacing w:after="20"/>
+        <w:spacing w:after="40"/>
+        <w:ind w:left="850"/>
         <w:jc w:val="left"/>
       </w:pPr>
       <w:r>
@@ -1553,12 +1598,13 @@
           <w:rFonts w:ascii="Calibri" w:hAnsi="Calibri"/>
           <w:sz w:val="24"/>
         </w:rPr>
-        <w:t xml:space="preserve">    Practical Implications</w:t>
+        <w:t>5.2 Practical Implications</w:t>
       </w:r>
     </w:p>
     <w:p>
       <w:pPr>
-        <w:spacing w:after="20"/>
+        <w:spacing w:after="40"/>
+        <w:ind w:left="850"/>
         <w:jc w:val="left"/>
       </w:pPr>
       <w:r>
@@ -1566,12 +1612,13 @@
           <w:rFonts w:ascii="Calibri" w:hAnsi="Calibri"/>
           <w:sz w:val="24"/>
         </w:rPr>
-        <w:t xml:space="preserve">    Comparison with Existing Systems</w:t>
+        <w:t>5.3 Comparison with Existing Systems</w:t>
       </w:r>
     </w:p>
     <w:p>
       <w:pPr>
-        <w:spacing w:after="20"/>
+        <w:spacing w:after="40"/>
+        <w:ind w:left="0"/>
         <w:jc w:val="left"/>
       </w:pPr>
       <w:r>
@@ -1579,12 +1626,13 @@
           <w:rFonts w:ascii="Calibri" w:hAnsi="Calibri"/>
           <w:sz w:val="24"/>
         </w:rPr>
-        <w:t xml:space="preserve">    Challenges and Limitations</w:t>
+        <w:t>06 Challenges and Limitations</w:t>
       </w:r>
     </w:p>
     <w:p>
       <w:pPr>
-        <w:spacing w:after="20"/>
+        <w:spacing w:after="40"/>
+        <w:ind w:left="0"/>
         <w:jc w:val="left"/>
       </w:pPr>
       <w:r>
@@ -1592,12 +1640,13 @@
           <w:rFonts w:ascii="Calibri" w:hAnsi="Calibri"/>
           <w:sz w:val="24"/>
         </w:rPr>
-        <w:t xml:space="preserve">    Ethical Considerations</w:t>
+        <w:t>07 Ethical Considerations</w:t>
       </w:r>
     </w:p>
     <w:p>
       <w:pPr>
-        <w:spacing w:after="20"/>
+        <w:spacing w:after="40"/>
+        <w:ind w:left="0"/>
         <w:jc w:val="left"/>
       </w:pPr>
       <w:r>
@@ -1605,12 +1654,13 @@
           <w:rFonts w:ascii="Calibri" w:hAnsi="Calibri"/>
           <w:sz w:val="24"/>
         </w:rPr>
-        <w:t>Conclusion and Future Work</w:t>
+        <w:t>08 Conclusion and Future Work</w:t>
       </w:r>
     </w:p>
     <w:p>
       <w:pPr>
-        <w:spacing w:after="20"/>
+        <w:spacing w:after="40"/>
+        <w:ind w:left="0"/>
         <w:jc w:val="left"/>
       </w:pPr>
       <w:r>
@@ -1618,12 +1668,13 @@
           <w:rFonts w:ascii="Calibri" w:hAnsi="Calibri"/>
           <w:sz w:val="24"/>
         </w:rPr>
-        <w:t>References</w:t>
+        <w:t>09 References</w:t>
       </w:r>
     </w:p>
     <w:p>
       <w:pPr>
-        <w:spacing w:after="20"/>
+        <w:spacing w:after="40"/>
+        <w:ind w:left="0"/>
         <w:jc w:val="left"/>
       </w:pPr>
       <w:r>
@@ -1631,7 +1682,7 @@
           <w:rFonts w:ascii="Calibri" w:hAnsi="Calibri"/>
           <w:sz w:val="24"/>
         </w:rPr>
-        <w:t>Appendices</w:t>
+        <w:t>10 Appendices</w:t>
       </w:r>
     </w:p>
     <w:p>
@@ -1647,13 +1698,8 @@
       </w:pPr>
     </w:p>
     <w:p>
-      <w:pPr>
-        <w:spacing w:before="240" w:after="240"/>
-        <w:jc w:val="left"/>
-      </w:pPr>
       <w:r>
         <w:rPr>
-          <w:rFonts w:ascii="Calibri" w:hAnsi="Calibri"/>
           <w:b/>
           <w:sz w:val="50"/>
         </w:rPr>
@@ -1662,7 +1708,8 @@
     </w:p>
     <w:p>
       <w:pPr>
-        <w:ind w:left="1814" w:hanging="340"/>
+        <w:spacing w:after="40"/>
+        <w:ind w:left="1134"/>
         <w:jc w:val="left"/>
       </w:pPr>
       <w:r>
@@ -1670,12 +1717,13 @@
           <w:rFonts w:ascii="Calibri" w:hAnsi="Calibri"/>
           <w:sz w:val="24"/>
         </w:rPr>
-        <w:t>Table 2.1: Comparison of AI and ML Applications in Insurance Cost Estimation</w:t>
+        <w:t>2.1    Comparison of AI and ML Applications in Insurance Cost Estimation</w:t>
       </w:r>
     </w:p>
     <w:p>
       <w:pPr>
-        <w:ind w:left="1814" w:hanging="340"/>
+        <w:spacing w:after="40"/>
+        <w:ind w:left="1134"/>
         <w:jc w:val="left"/>
       </w:pPr>
       <w:r>
@@ -1683,12 +1731,13 @@
           <w:rFonts w:ascii="Calibri" w:hAnsi="Calibri"/>
           <w:sz w:val="24"/>
         </w:rPr>
-        <w:t>Table 2.2: Alignment of Project Objectives with Related Studies</w:t>
+        <w:t>2.2    Alignment of Project Objectives with Related Studies and the Proposed System</w:t>
       </w:r>
     </w:p>
     <w:p>
       <w:pPr>
-        <w:ind w:left="1814" w:hanging="340"/>
+        <w:spacing w:after="40"/>
+        <w:ind w:left="1134"/>
         <w:jc w:val="left"/>
       </w:pPr>
       <w:r>
@@ -1696,12 +1745,13 @@
           <w:rFonts w:ascii="Calibri" w:hAnsi="Calibri"/>
           <w:sz w:val="24"/>
         </w:rPr>
-        <w:t>Table 3.1: Seven-Tier Expert Cost Engine Ranges</w:t>
+        <w:t>3.1    Seven-Tier Expert Cost Engine Ranges</w:t>
       </w:r>
     </w:p>
     <w:p>
       <w:pPr>
-        <w:ind w:left="1814" w:hanging="340"/>
+        <w:spacing w:after="40"/>
+        <w:ind w:left="1134"/>
         <w:jc w:val="left"/>
       </w:pPr>
       <w:r>
@@ -1709,12 +1759,13 @@
           <w:rFonts w:ascii="Calibri" w:hAnsi="Calibri"/>
           <w:sz w:val="24"/>
         </w:rPr>
-        <w:t>Table 4.1: Model Comparison Results on Validation Set</w:t>
+        <w:t>4.1    Model Comparison Results on Validation Set</w:t>
       </w:r>
     </w:p>
     <w:p>
       <w:pPr>
-        <w:ind w:left="1814" w:hanging="340"/>
+        <w:spacing w:after="40"/>
+        <w:ind w:left="1134"/>
         <w:jc w:val="left"/>
       </w:pPr>
       <w:r>
@@ -1722,12 +1773,13 @@
           <w:rFonts w:ascii="Calibri" w:hAnsi="Calibri"/>
           <w:sz w:val="24"/>
         </w:rPr>
-        <w:t>Table 4.2: Final Hold-Out Test Set Performance Metrics</w:t>
+        <w:t>4.2    Final Hold-Out Test Set Performance Metrics</w:t>
       </w:r>
     </w:p>
     <w:p>
       <w:pPr>
-        <w:ind w:left="1814" w:hanging="340"/>
+        <w:spacing w:after="40"/>
+        <w:ind w:left="1134"/>
         <w:jc w:val="left"/>
       </w:pPr>
       <w:r>
@@ -1735,7 +1787,7 @@
           <w:rFonts w:ascii="Calibri" w:hAnsi="Calibri"/>
           <w:sz w:val="24"/>
         </w:rPr>
-        <w:t>Table 4.3: Expert Engine Prediction Samples Across Severity Tiers</w:t>
+        <w:t>4.3    Expert Engine Prediction Samples Across Severity Tiers</w:t>
       </w:r>
     </w:p>
     <w:p>
@@ -1750,13 +1802,8 @@
       </w:pPr>
     </w:p>
     <w:p>
-      <w:pPr>
-        <w:spacing w:before="240" w:after="240"/>
-        <w:jc w:val="left"/>
-      </w:pPr>
       <w:r>
         <w:rPr>
-          <w:rFonts w:ascii="Calibri" w:hAnsi="Calibri"/>
           <w:b/>
           <w:sz w:val="50"/>
         </w:rPr>
@@ -1765,7 +1812,8 @@
     </w:p>
     <w:p>
       <w:pPr>
-        <w:ind w:left="1814" w:hanging="340"/>
+        <w:spacing w:after="40"/>
+        <w:ind w:left="1134"/>
         <w:jc w:val="left"/>
       </w:pPr>
       <w:r>
@@ -1773,12 +1821,13 @@
           <w:rFonts w:ascii="Calibri" w:hAnsi="Calibri"/>
           <w:sz w:val="24"/>
         </w:rPr>
-        <w:t>Figure 3.1: Overall Workflow of the Proposed SmartClaim AI System</w:t>
+        <w:t>3.1    Overall Workflow of the Proposed SmartClaim AI System</w:t>
       </w:r>
     </w:p>
     <w:p>
       <w:pPr>
-        <w:ind w:left="1814" w:hanging="340"/>
+        <w:spacing w:after="40"/>
+        <w:ind w:left="1134"/>
         <w:jc w:val="left"/>
       </w:pPr>
       <w:r>
@@ -1786,12 +1835,13 @@
           <w:rFonts w:ascii="Calibri" w:hAnsi="Calibri"/>
           <w:sz w:val="24"/>
         </w:rPr>
-        <w:t>Figure 3.2: Hybrid Feature Vector Construction Pipeline</w:t>
+        <w:t>3.2    Hybrid Feature Vector Construction Pipeline</w:t>
       </w:r>
     </w:p>
     <w:p>
       <w:pPr>
-        <w:ind w:left="1814" w:hanging="340"/>
+        <w:spacing w:after="40"/>
+        <w:ind w:left="1134"/>
         <w:jc w:val="left"/>
       </w:pPr>
       <w:r>
@@ -1799,12 +1849,13 @@
           <w:rFonts w:ascii="Calibri" w:hAnsi="Calibri"/>
           <w:sz w:val="24"/>
         </w:rPr>
-        <w:t>Figure 3.3: Seven-Tier Expert Cost Engine Architecture</w:t>
+        <w:t>3.3    Seven-Tier Expert Cost Engine Architecture</w:t>
       </w:r>
     </w:p>
     <w:p>
       <w:pPr>
-        <w:ind w:left="1814" w:hanging="340"/>
+        <w:spacing w:after="40"/>
+        <w:ind w:left="1134"/>
         <w:jc w:val="left"/>
       </w:pPr>
       <w:r>
@@ -1812,12 +1863,13 @@
           <w:rFonts w:ascii="Calibri" w:hAnsi="Calibri"/>
           <w:sz w:val="24"/>
         </w:rPr>
-        <w:t>Figure 4.1: Actual vs. Predicted Cost Scatter Plot</w:t>
+        <w:t>4.1    Actual vs. Predicted Cost Scatter Plot</w:t>
       </w:r>
     </w:p>
     <w:p>
       <w:pPr>
-        <w:ind w:left="1814" w:hanging="340"/>
+        <w:spacing w:after="40"/>
+        <w:ind w:left="1134"/>
         <w:jc w:val="left"/>
       </w:pPr>
       <w:r>
@@ -1825,12 +1877,13 @@
           <w:rFonts w:ascii="Calibri" w:hAnsi="Calibri"/>
           <w:sz w:val="24"/>
         </w:rPr>
-        <w:t>Figure 4.2: Residuals Distribution Histogram</w:t>
+        <w:t>4.2    Residuals Distribution Histogram</w:t>
       </w:r>
     </w:p>
     <w:p>
       <w:pPr>
-        <w:ind w:left="1814" w:hanging="340"/>
+        <w:spacing w:after="40"/>
+        <w:ind w:left="1134"/>
         <w:jc w:val="left"/>
       </w:pPr>
       <w:r>
@@ -1838,12 +1891,13 @@
           <w:rFonts w:ascii="Calibri" w:hAnsi="Calibri"/>
           <w:sz w:val="24"/>
         </w:rPr>
-        <w:t>Figure 4.3: Top 20 Feature Importances</w:t>
+        <w:t>4.3    Top 20 Feature Importances</w:t>
       </w:r>
     </w:p>
     <w:p>
       <w:pPr>
-        <w:ind w:left="1814" w:hanging="340"/>
+        <w:spacing w:after="40"/>
+        <w:ind w:left="1134"/>
         <w:jc w:val="left"/>
       </w:pPr>
       <w:r>
@@ -1851,12 +1905,13 @@
           <w:rFonts w:ascii="Calibri" w:hAnsi="Calibri"/>
           <w:sz w:val="24"/>
         </w:rPr>
-        <w:t>Figure 4.4: Cost Distribution of the Dataset</w:t>
+        <w:t>4.4    Cost Distribution of the Dataset</w:t>
       </w:r>
     </w:p>
     <w:p>
       <w:pPr>
-        <w:ind w:left="1814" w:hanging="340"/>
+        <w:spacing w:after="40"/>
+        <w:ind w:left="1134"/>
         <w:jc w:val="left"/>
       </w:pPr>
       <w:r>
@@ -1864,12 +1919,13 @@
           <w:rFonts w:ascii="Calibri" w:hAnsi="Calibri"/>
           <w:sz w:val="24"/>
         </w:rPr>
-        <w:t>Figure A.1: SmartClaim AI Dashboard Interface</w:t>
+        <w:t>A.1    SmartClaim AI Dashboard Interface</w:t>
       </w:r>
     </w:p>
     <w:p>
       <w:pPr>
-        <w:ind w:left="1814" w:hanging="340"/>
+        <w:spacing w:after="40"/>
+        <w:ind w:left="1134"/>
         <w:jc w:val="left"/>
       </w:pPr>
       <w:r>
@@ -1877,12 +1933,13 @@
           <w:rFonts w:ascii="Calibri" w:hAnsi="Calibri"/>
           <w:sz w:val="24"/>
         </w:rPr>
-        <w:t>Figure A.2: Prediction Page with Arabic Text Input</w:t>
+        <w:t>A.2    Prediction Page with Arabic Text Input</w:t>
       </w:r>
     </w:p>
     <w:p>
       <w:pPr>
-        <w:ind w:left="1814" w:hanging="340"/>
+        <w:spacing w:after="40"/>
+        <w:ind w:left="1134"/>
         <w:jc w:val="left"/>
       </w:pPr>
       <w:r>
@@ -1890,7 +1947,7 @@
           <w:rFonts w:ascii="Calibri" w:hAnsi="Calibri"/>
           <w:sz w:val="24"/>
         </w:rPr>
-        <w:t>Figure A.3: Dataset Explorer Interface</w:t>
+        <w:t>A.3    Dataset Explorer Interface</w:t>
       </w:r>
     </w:p>
     <w:p>
@@ -1906,6 +1963,7 @@
     </w:p>
     <w:p>
       <w:pPr>
+        <w:spacing w:before="240" w:after="240"/>
         <w:jc w:val="left"/>
       </w:pPr>
       <w:r>
@@ -1919,7 +1977,7 @@
     </w:p>
     <w:p>
       <w:pPr>
-        <w:spacing w:before="160" w:after="120"/>
+        <w:spacing w:before="200" w:after="120"/>
         <w:jc w:val="left"/>
       </w:pPr>
       <w:r>
@@ -1928,21 +1986,7 @@
           <w:b/>
           <w:sz w:val="32"/>
         </w:rPr>
-        <w:t>Introduction</w:t>
-      </w:r>
-    </w:p>
-    <w:p>
-      <w:pPr>
-        <w:spacing w:before="120" w:after="80"/>
-        <w:jc w:val="left"/>
-      </w:pPr>
-      <w:r>
-        <w:rPr>
-          <w:rFonts w:ascii="Calibri" w:hAnsi="Calibri"/>
-          <w:b/>
-          <w:sz w:val="28"/>
-        </w:rPr>
-        <w:t>Problem Definition and Background</w:t>
+        <w:t>1.1 Problem Definition and Background</w:t>
       </w:r>
     </w:p>
     <w:p>
@@ -1958,7 +2002,7 @@
           <w:i w:val="0"/>
           <w:sz w:val="24"/>
         </w:rPr>
-        <w:t>The Saudi automotive insurance industry processes millions of vehicle accident claims annually, each requiring a detailed assessment of vehicle damage and an estimation of repair costs in Saudi Riyals (SAR). The Kingdom’s authorised traffic accident management entity, Najm for Insurance Services, along with the national vehicle damage estimation platform Taqdeer operating under the Saudi Central Bank (SAMA), collectively handle the vast majority of these assessments [1][2].</w:t>
+        <w:t>The Saudi automotive insurance industry processes millions of vehicle accident claims annually, each requiring a detailed assessment of vehicle damage and an estimation of repair costs in Saudi Riyals (SAR). The Kingdom’s authorised traffic accident management entity, Najm for Insurance Services, along with the national vehicle damage estimation platform Taqdeer operating under the Saudi Central Bank (SAMA), collectively handle the vast majority of these assessments. Despite their critical role in the insurance value chain, current cost estimation practices remain largely dependent on manual expert inspections, where trained adjusters physically examine damaged vehicles or review textual accident reports to assign repair cost estimates [1][2].</w:t>
       </w:r>
     </w:p>
     <w:p>
@@ -1974,7 +2018,7 @@
           <w:i w:val="0"/>
           <w:sz w:val="24"/>
         </w:rPr>
-        <w:t>These manual assessment processes are inherently limited by several constraints. They are time-consuming, as each claim requires individual expert attention. They introduce subjectivity, as different adjusters may arrive at different estimates for identical damage. They are difficult to scale across the rapidly growing Saudi insurance market [3].</w:t>
+        <w:t>These manual assessment processes, while valuable in their reliance on domain expertise, are inherently limited by several fundamental constraints. First, they are time-consuming, as each claim requires individual expert attention, creating bottlenecks during periods of high claim volumes. Second, they introduce subjectivity, as different adjusters may arrive at different cost estimates for identical damage descriptions, depending on their experience, interpretation, and regional pricing knowledge. Third, they are difficult to scale across the rapidly growing Saudi insurance market, which has seen significant expansion driven by mandatory vehicle insurance regulations and increasing vehicle ownership rates across the Kingdom [3].</w:t>
       </w:r>
     </w:p>
     <w:p>
@@ -1990,7 +2034,7 @@
           <w:i w:val="0"/>
           <w:sz w:val="24"/>
         </w:rPr>
-        <w:t>A significant challenge lies in the interpretation of Arabic-language accident reports. These reports describe vehicle damage using a rich but highly variable vocabulary that includes formal Modern Standard Arabic, Saudi dialectal expressions, and domain-specific automotive terminology. For instance, “شاصيه” (chassis) indicates structural damage, while “خدش” (scratch) suggests minimal surface damage [4][5].</w:t>
+        <w:t>A particularly significant challenge lies in the interpretation of Arabic-language accident reports. These reports, submitted by policyholders, traffic police, and insurance representatives, describe vehicle damage using a rich but highly variable vocabulary that includes formal Modern Standard Arabic terms, Saudi dialectal expressions, and domain-specific automotive terminology. For instance, the Arabic word “شاصيه” (chassis) carries critical implications for cost estimation as it indicates structural damage, while “خدش” (scratch) suggests minimal surface damage. The semantic gap between these terms and their financial implications is precisely the kind of knowledge that experienced human adjusters possess but that traditional rule-based software systems struggle to capture [4][5].</w:t>
       </w:r>
     </w:p>
     <w:p>
@@ -2006,7 +2050,7 @@
           <w:i w:val="0"/>
           <w:sz w:val="24"/>
         </w:rPr>
-        <w:t>A fundamental limitation in pure machine learning approaches is the bucketing bias problem. Regression models tend to collapse diverse damage scenarios into a narrow band of similar predictions, effectively assigning moderate cost estimates to both minor scratches and severe structural damage [6].</w:t>
+        <w:t>In recent years, there has been growing interest in the application of artificial intelligence and machine learning techniques to automate various aspects of insurance claims processing. Natural language processing has emerged as a particularly promising technology for extracting structured information from unstructured text documents, while regression-based machine learning models have demonstrated strong potential for numerical cost prediction tasks. However, most existing research in this domain focuses on English-language applications, with limited attention to the unique challenges posed by Arabic text processing in the insurance context [6][7].</w:t>
       </w:r>
     </w:p>
     <w:p>
@@ -2022,35 +2066,7 @@
           <w:i w:val="0"/>
           <w:sz w:val="24"/>
         </w:rPr>
-        <w:t>Therefore, there is a clear need for an intelligent system that combines semantic understanding with domain-specific expert knowledge to produce accurate, granular cost estimates from Arabic accident descriptions.</w:t>
-      </w:r>
-    </w:p>
-    <w:p>
-      <w:pPr>
-        <w:spacing w:before="120" w:after="80"/>
-        <w:jc w:val="left"/>
-      </w:pPr>
-      <w:r>
-        <w:rPr>
-          <w:rFonts w:ascii="Calibri" w:hAnsi="Calibri"/>
-          <w:b/>
-          <w:sz w:val="28"/>
-        </w:rPr>
-        <w:t>Problem Objectives and Scope</w:t>
-      </w:r>
-    </w:p>
-    <w:p>
-      <w:pPr>
-        <w:spacing w:before="80" w:after="80"/>
-        <w:jc w:val="both"/>
-      </w:pPr>
-      <w:r>
-        <w:rPr>
-          <w:rFonts w:ascii="Calibri" w:hAnsi="Calibri"/>
-          <w:b/>
-          <w:sz w:val="24"/>
-        </w:rPr>
-        <w:t>Project Goal</w:t>
+        <w:t>Furthermore, a fundamental limitation observed in pure machine learning approaches to cost estimation is what this research terms the bucketing bias problem. When trained on typical insurance datasets, regression models tend to collapse diverse damage scenarios into a narrow band of similar predictions, effectively assigning moderate cost estimates to both minor scratches and severe structural damage. This phenomenon arises because the model learns to minimise overall prediction error by converging toward the mean of the training distribution, rather than capturing the full spectrum of damage severities and their corresponding cost implications [8].</w:t>
       </w:r>
     </w:p>
     <w:p>
@@ -2066,21 +2082,65 @@
           <w:i w:val="0"/>
           <w:sz w:val="24"/>
         </w:rPr>
-        <w:t>The primary goal of this project is to develop SmartClaim AI, an intelligent hybrid pipeline that leverages Transformer-based NLP, ensemble machine learning regression, and a domain-calibrated expert rule engine to automate vehicle repair cost prediction from Arabic accident descriptions.</w:t>
+        <w:t>Therefore, there is a clear need for an intelligent system that combines the semantic understanding capabilities of modern natural language processing with domain-specific expert knowledge to produce accurate, granular, and contextually appropriate cost estimates from Arabic accident descriptions. Such a system must not only understand the linguistic nuances of Arabic damage reporting but also apply the kind of tiered cost reasoning that experienced insurance professionals employ in their daily assessments.</w:t>
       </w:r>
     </w:p>
     <w:p>
       <w:pPr>
-        <w:spacing w:before="80" w:after="80"/>
-        <w:jc w:val="both"/>
+        <w:spacing w:before="200" w:after="120"/>
+        <w:jc w:val="left"/>
       </w:pPr>
       <w:r>
         <w:rPr>
           <w:rFonts w:ascii="Calibri" w:hAnsi="Calibri"/>
           <w:b/>
+          <w:sz w:val="32"/>
+        </w:rPr>
+        <w:t>1.2 Problem Objectives and Scope</w:t>
+      </w:r>
+    </w:p>
+    <w:p>
+      <w:pPr>
+        <w:spacing w:before="160" w:after="80"/>
+        <w:jc w:val="left"/>
+      </w:pPr>
+      <w:r>
+        <w:rPr>
+          <w:rFonts w:ascii="Calibri" w:hAnsi="Calibri"/>
+          <w:b/>
+          <w:sz w:val="28"/>
+        </w:rPr>
+        <w:t>1.2.1 Project Goal</w:t>
+      </w:r>
+    </w:p>
+    <w:p>
+      <w:pPr>
+        <w:spacing w:after="160"/>
+        <w:ind w:left="1134"/>
+        <w:jc w:val="both"/>
+      </w:pPr>
+      <w:r>
+        <w:rPr>
+          <w:rFonts w:ascii="Calibri" w:hAnsi="Calibri"/>
+          <w:b w:val="0"/>
+          <w:i w:val="0"/>
           <w:sz w:val="24"/>
         </w:rPr>
-        <w:t>Project Objectives</w:t>
+        <w:t>The primary goal of this project is to develop SmartClaim AI, an intelligent hybrid pipeline that leverages Transformer-based natural language processing, ensemble machine learning regression, and a domain-calibrated expert rule engine to automate and enhance the accuracy of vehicle repair cost prediction from Arabic accident descriptions, enabling data-driven decision-making for scalable insurance claims processing in the Saudi automotive sector.</w:t>
+      </w:r>
+    </w:p>
+    <w:p>
+      <w:pPr>
+        <w:spacing w:before="160" w:after="80"/>
+        <w:jc w:val="left"/>
+      </w:pPr>
+      <w:r>
+        <w:rPr>
+          <w:rFonts w:ascii="Calibri" w:hAnsi="Calibri"/>
+          <w:b/>
+          <w:sz w:val="28"/>
+        </w:rPr>
+        <w:t>1.2.2 Project Objectives</w:t>
       </w:r>
     </w:p>
     <w:p>
@@ -2109,7 +2169,7 @@
           <w:rFonts w:ascii="Calibri" w:hAnsi="Calibri"/>
           <w:sz w:val="24"/>
         </w:rPr>
-        <w:t>•  Develop a multilingual Sentence Transformer-based embedding module for converting Arabic accident descriptions into high-dimensional semantic representations.</w:t>
+        <w:t>•  Develop a multilingual Sentence Transformer-based embedding module capable of converting Arabic accident descriptions into high-dimensional semantic representations that capture the contextual meaning of damage-related terminology.</w:t>
       </w:r>
     </w:p>
     <w:p>
@@ -2122,7 +2182,7 @@
           <w:rFonts w:ascii="Calibri" w:hAnsi="Calibri"/>
           <w:sz w:val="24"/>
         </w:rPr>
-        <w:t>•  Design a custom Arabic NLP feature extractor that identifies domain-specific keywords related to damage severity, impact location, and affected vehicle parts.</w:t>
+        <w:t>•  Design and implement a custom Arabic natural language processing feature extractor that identifies domain-specific keywords related to damage severity, impact location, and affected vehicle parts from Saudi dialectal and formal Arabic text.</w:t>
       </w:r>
     </w:p>
     <w:p>
@@ -2135,7 +2195,7 @@
           <w:rFonts w:ascii="Calibri" w:hAnsi="Calibri"/>
           <w:sz w:val="24"/>
         </w:rPr>
-        <w:t>•  Construct a hybrid feature vector by concatenating dense semantic embeddings with structured rule-based features.</w:t>
+        <w:t>•  Construct a hybrid feature vector by concatenating dense semantic embeddings with structured rule-based features, creating a unified representation that combines contextual understanding with explicit domain signals.</w:t>
       </w:r>
     </w:p>
     <w:p>
@@ -2148,7 +2208,7 @@
           <w:rFonts w:ascii="Calibri" w:hAnsi="Calibri"/>
           <w:sz w:val="24"/>
         </w:rPr>
-        <w:t>•  Train and evaluate multiple ensemble regression models using randomized hyperparameter search with cross-validation.</w:t>
+        <w:t>•  Train and evaluate multiple ensemble regression models, including Random Forest and XGBoost, using randomized hyperparameter search with cross-validation to identify the optimal model configuration for cost prediction.</w:t>
       </w:r>
     </w:p>
     <w:p>
@@ -2161,7 +2221,7 @@
           <w:rFonts w:ascii="Calibri" w:hAnsi="Calibri"/>
           <w:sz w:val="24"/>
         </w:rPr>
-        <w:t>•  Develop a seven-tier Expert Cost Engine that post-processes ML predictions within domain-calibrated Saudi Riyal ranges.</w:t>
+        <w:t>•  Develop a seven-tier Expert Cost Engine that post-processes machine learning predictions by constraining them within domain-calibrated Saudi Riyal ranges, addressing the bucketing bias problem inherent in pure ML approaches.</w:t>
       </w:r>
     </w:p>
     <w:p>
@@ -2174,21 +2234,21 @@
           <w:rFonts w:ascii="Calibri" w:hAnsi="Calibri"/>
           <w:sz w:val="24"/>
         </w:rPr>
-        <w:t>•  Design an interactive web dashboard using Streamlit for real-time cost prediction and model monitoring.</w:t>
+        <w:t>•  Design and implement an interactive web-based dashboard using Streamlit that provides insurance professionals with a premium, user-friendly interface for real-time cost prediction, model performance monitoring, and dataset exploration.</w:t>
       </w:r>
     </w:p>
     <w:p>
       <w:pPr>
-        <w:spacing w:before="80" w:after="80"/>
-        <w:jc w:val="both"/>
+        <w:spacing w:before="200" w:after="120"/>
+        <w:jc w:val="left"/>
       </w:pPr>
       <w:r>
         <w:rPr>
           <w:rFonts w:ascii="Calibri" w:hAnsi="Calibri"/>
           <w:b/>
-          <w:sz w:val="24"/>
+          <w:sz w:val="32"/>
         </w:rPr>
-        <w:t>Relevance and Significance</w:t>
+        <w:t>1.3 Relevance and Significance</w:t>
       </w:r>
     </w:p>
     <w:p>
@@ -2204,7 +2264,7 @@
           <w:i w:val="0"/>
           <w:sz w:val="24"/>
         </w:rPr>
-        <w:t>The proposed system seeks to enhance the efficiency and consistency of vehicle damage cost estimation by converting unstructured Arabic text into meaningful financial predictions. It aligns with Saudi Arabia’s Vision 2030 objectives for digital transformation and innovation-driven economic development [7].</w:t>
+        <w:t>The proposed system seeks to enhance the efficiency and consistency of vehicle damage cost estimation by converting unstructured Arabic text into meaningful and actionable financial predictions. By doing so, it aims to reduce dependence on time-consuming manual inspections, improve the consistency of cost estimates across different assessors, and support early-stage triage of insurance claims based on predicted damage severity. Furthermore, the project contributes to improved claims management practices and promotes more intelligent, scalable, and data-driven approaches to insurance operations in the Saudi automotive sector. The system aligns with Saudi Arabia’s Vision 2030 objectives for digital transformation and innovation-driven economic development across the financial services sector [9].</w:t>
       </w:r>
     </w:p>
     <w:p>
@@ -2221,6 +2281,7 @@
     </w:p>
     <w:p>
       <w:pPr>
+        <w:spacing w:before="240" w:after="240"/>
         <w:jc w:val="left"/>
       </w:pPr>
       <w:r>
@@ -2234,7 +2295,7 @@
     </w:p>
     <w:p>
       <w:pPr>
-        <w:spacing w:before="160" w:after="120"/>
+        <w:spacing w:before="200" w:after="120"/>
         <w:jc w:val="left"/>
       </w:pPr>
       <w:r>
@@ -2243,21 +2304,7 @@
           <w:b/>
           <w:sz w:val="32"/>
         </w:rPr>
-        <w:t>Literature Review</w:t>
-      </w:r>
-    </w:p>
-    <w:p>
-      <w:pPr>
-        <w:spacing w:before="120" w:after="80"/>
-        <w:jc w:val="left"/>
-      </w:pPr>
-      <w:r>
-        <w:rPr>
-          <w:rFonts w:ascii="Calibri" w:hAnsi="Calibri"/>
-          <w:b/>
-          <w:sz w:val="28"/>
-        </w:rPr>
-        <w:t>Overview of Related Work</w:t>
+        <w:t>2.1 Overview of Related Work</w:t>
       </w:r>
     </w:p>
     <w:p>
@@ -2273,21 +2320,21 @@
           <w:i w:val="0"/>
           <w:sz w:val="24"/>
         </w:rPr>
-        <w:t>Insurance cost estimation and claims automation represent rapidly evolving areas within the broader field of artificial intelligence applications in financial services. Traditional approaches rely on expert assessments that are susceptible to variability, delays, and scalability constraints.</w:t>
+        <w:t>Insurance cost estimation and claims automation represent rapidly evolving areas within the broader field of artificial intelligence applications in financial services. These processes traditionally rely on the combined expertise of damage assessors, actuarial professionals, and domain-specific knowledge bases to convert qualitative damage descriptions into quantitative cost estimates. Nevertheless, such manual approaches are susceptible to human variability, processing delays, and scalability constraints as claim volumes increase in growing insurance markets.</w:t>
       </w:r>
     </w:p>
     <w:p>
       <w:pPr>
-        <w:spacing w:before="120" w:after="80"/>
+        <w:spacing w:before="200" w:after="120"/>
         <w:jc w:val="left"/>
       </w:pPr>
       <w:r>
         <w:rPr>
           <w:rFonts w:ascii="Calibri" w:hAnsi="Calibri"/>
           <w:b/>
-          <w:sz w:val="28"/>
+          <w:sz w:val="32"/>
         </w:rPr>
-        <w:t>Summary of Related Works</w:t>
+        <w:t>2.2 Summary of Related Works</w:t>
       </w:r>
     </w:p>
     <w:p>
@@ -2303,7 +2350,7 @@
           <w:i w:val="0"/>
           <w:sz w:val="24"/>
         </w:rPr>
-        <w:t>Ly et al. (2020) investigate NLP techniques for automating insurance claims assessment, combining TF-IDF vectorisation and ensemble methods to categorise claims by severity, achieving accuracies above 85 percent. However, the study focuses exclusively on English-language claims [8].</w:t>
+        <w:t>Ly et al. (2020) investigate the application of natural language processing techniques for automating insurance claims assessment. The study addresses the challenge of extracting structured information from unstructured claims narratives. The authors propose a pipeline combining text preprocessing, named entity recognition, and classification models to categorise claims by severity, achieving classification accuracies above 85 percent. However, the study focuses exclusively on English-language claims and does not address cost estimation directly [8].</w:t>
       </w:r>
     </w:p>
     <w:p>
@@ -2319,7 +2366,7 @@
           <w:i w:val="0"/>
           <w:sz w:val="24"/>
         </w:rPr>
-        <w:t>Reimers and Gurevych (2019) introduce Sentence-BERT, using siamese network structures to derive semantically meaningful sentence embeddings. The paraphrase-multilingual-mpnet-base-v2 model used in SmartClaim AI is a direct extension of this architecture [9].</w:t>
+        <w:t>Reimers and Gurevych (2019) introduce Sentence-BERT (SBERT), a modification of the pretrained BERT network that uses siamese and triplet network structures to derive semantically meaningful sentence embeddings. The resulting model produces fixed-size sentence embeddings that capture deep semantic relationships. This work is foundational to the SmartClaim AI system, as the paraphrase-multilingual-mpnet-base-v2 model used in this project is a direct extension of the SBERT architecture [9].</w:t>
       </w:r>
     </w:p>
     <w:p>
@@ -2335,7 +2382,7 @@
           <w:i w:val="0"/>
           <w:sz w:val="24"/>
         </w:rPr>
-        <w:t>Chen and Guestrin (2016) present XGBoost, a scalable tree boosting system widely used for structured data prediction, with built-in regularisation mechanisms that help prevent overfitting on small datasets [10].</w:t>
+        <w:t>Chen and Guestrin (2016) present XGBoost, a scalable end-to-end tree boosting system that has become one of the most widely used machine learning algorithms for structured data prediction tasks. Its ability to handle mixed feature types, capture non-linear relationships, and provide feature importance rankings makes it particularly suitable for insurance applications [10].</w:t>
       </w:r>
     </w:p>
     <w:p>
@@ -2351,7 +2398,7 @@
           <w:i w:val="0"/>
           <w:sz w:val="24"/>
         </w:rPr>
-        <w:t>Breiman (2001) introduces Random Forests, an ensemble method combining bagging with random feature selection to produce robust predictions with feature importance measures [11].</w:t>
+        <w:t>Breiman (2001) introduces Random Forests, an ensemble learning method that constructs multiple decision trees during training and outputs the mean prediction of the individual trees for regression tasks. Random Forests have been extensively applied in insurance risk modelling and cost estimation due to their resistance to overfitting and interpretability through feature importance measures [11].</w:t>
       </w:r>
     </w:p>
     <w:p>
@@ -2367,7 +2414,7 @@
           <w:i w:val="0"/>
           <w:sz w:val="24"/>
         </w:rPr>
-        <w:t>Habash (2010) provides a comprehensive overview of Arabic NLP, highlighting the rich morphological structure and dialectal variation that distinguish Arabic from other widely studied languages [4].</w:t>
+        <w:t>Habash (2010) provides a comprehensive overview of Arabic natural language processing, addressing the unique morphological, syntactic, and dialectal challenges that distinguish Arabic from other widely studied languages. The study emphasises that Arabic text often lacks diacritical marks in informal writing, creating ambiguity, and that regional dialects introduce vocabulary that differs substantially from formal Arabic [4].</w:t>
       </w:r>
     </w:p>
     <w:p>
@@ -2383,7 +2430,7 @@
           <w:i w:val="0"/>
           <w:sz w:val="24"/>
         </w:rPr>
-        <w:t>Antoun et al. (2020) present AraBERT, a pretrained Arabic language model demonstrating state-of-the-art performance on Arabic NLP benchmarks [12].</w:t>
+        <w:t>Antoun et al. (2020) present AraBERT, a pretrained language model for Arabic based on the BERT architecture, demonstrating state-of-the-art performance on several Arabic NLP benchmarks. In the context of this project, the decision to use a multilingual model rather than an Arabic-specific model was motivated by the need for sentence-level embeddings and the availability of pretrained paraphrase models with multilingual support [12].</w:t>
       </w:r>
     </w:p>
     <w:p>
@@ -2399,7 +2446,7 @@
           <w:i w:val="0"/>
           <w:sz w:val="24"/>
         </w:rPr>
-        <w:t>Soni et al. (2011) explore expert systems in insurance, demonstrating how rule-based reasoning can complement statistical models for claims assessment [13].</w:t>
+        <w:t>Soni et al. (2011) explore the application of expert systems and artificial intelligence in the insurance industry, examining how rule-based reasoning can complement statistical models. The research highlights that while ML models excel at pattern recognition, they often lack the domain-specific calibration needed to produce predictions that align with industry-standard pricing structures [13].</w:t>
       </w:r>
     </w:p>
     <w:p>
@@ -2415,21 +2462,21 @@
           <w:i w:val="0"/>
           <w:sz w:val="24"/>
         </w:rPr>
-        <w:t>Dhieb et al. (2019) investigate a deep learning approach to automated car damage assessment combining CNNs for images with RNNs for text, though focusing on English [14].</w:t>
+        <w:t>Dhieb et al. (2019) investigate a deep learning approach to automated car damage assessment from images and textual descriptions. While the study demonstrates the potential of multimodal approaches, it focuses primarily on English-language descriptions, leaving a gap in Arabic text-only analysis that SmartClaim AI addresses [14].</w:t>
       </w:r>
     </w:p>
     <w:p>
       <w:pPr>
-        <w:spacing w:before="120" w:after="80"/>
+        <w:spacing w:before="200" w:after="120"/>
         <w:jc w:val="left"/>
       </w:pPr>
       <w:r>
         <w:rPr>
           <w:rFonts w:ascii="Calibri" w:hAnsi="Calibri"/>
           <w:b/>
-          <w:sz w:val="28"/>
+          <w:sz w:val="32"/>
         </w:rPr>
-        <w:t>Comparison of Related Works</w:t>
+        <w:t>2.3 Comparison of Related Works</w:t>
       </w:r>
     </w:p>
     <w:p>
@@ -3199,16 +3246,16 @@
     <w:p/>
     <w:p>
       <w:pPr>
-        <w:spacing w:before="120" w:after="80"/>
+        <w:spacing w:before="200" w:after="120"/>
         <w:jc w:val="left"/>
       </w:pPr>
       <w:r>
         <w:rPr>
           <w:rFonts w:ascii="Calibri" w:hAnsi="Calibri"/>
           <w:b/>
-          <w:sz w:val="28"/>
+          <w:sz w:val="32"/>
         </w:rPr>
-        <w:t>Research Gap</w:t>
+        <w:t>2.4 Research Gap</w:t>
       </w:r>
     </w:p>
     <w:p>
@@ -3224,7 +3271,7 @@
           <w:i w:val="0"/>
           <w:sz w:val="24"/>
         </w:rPr>
-        <w:t>Current research lacks comprehensive systems that integrate Arabic NLP, semantic embedding, ensemble regression, and domain-calibrated expert reasoning for granular cost estimation from Arabic accident descriptions. Most existing work focuses on English, classification rather than regression, and treats ML and expert knowledge as separate concerns. SmartClaim AI addresses these gaps through a unified Expert-Steered ML pipeline.</w:t>
+        <w:t>Although notable progress has been made in the application of artificial intelligence to insurance claims processing and cost estimation, several important research gaps persist. First, much of the existing literature concentrates on English-language applications, with limited attention to the unique morphological and dialectal challenges of Arabic text processing in specialised domains such as insurance. Second, many studies focus primarily on classification tasks rather than providing granular numerical cost estimates that reflect real-world pricing structures. Third, the integration of modern deep learning-based NLP with domain-calibrated expert post-processing has not been investigated as a unified pipeline. The proposed SmartClaim AI system seeks to address these gaps.</w:t>
       </w:r>
     </w:p>
     <w:p>
@@ -3240,7 +3287,7 @@
           <w:i w:val="0"/>
           <w:sz w:val="24"/>
         </w:rPr>
-        <w:t>Table 2.2: Alignment of Project Objectives with Related Studies.</w:t>
+        <w:t>Table 2.2: Alignment of Project Objectives with Related Studies and the Proposed System.</w:t>
       </w:r>
     </w:p>
     <w:tbl>
@@ -3818,6 +3865,7 @@
     </w:p>
     <w:p>
       <w:pPr>
+        <w:spacing w:before="240" w:after="240"/>
         <w:jc w:val="left"/>
       </w:pPr>
       <w:r>
@@ -3831,20 +3879,6 @@
     </w:p>
     <w:p>
       <w:pPr>
-        <w:spacing w:before="160" w:after="120"/>
-        <w:jc w:val="left"/>
-      </w:pPr>
-      <w:r>
-        <w:rPr>
-          <w:rFonts w:ascii="Calibri" w:hAnsi="Calibri"/>
-          <w:b/>
-          <w:sz w:val="32"/>
-        </w:rPr>
-        <w:t>Methodology</w:t>
-      </w:r>
-    </w:p>
-    <w:p>
-      <w:pPr>
         <w:spacing w:after="160"/>
         <w:ind w:left="1134"/>
         <w:jc w:val="both"/>
@@ -3856,21 +3890,21 @@
           <w:i w:val="0"/>
           <w:sz w:val="24"/>
         </w:rPr>
-        <w:t>This study adopts a hybrid Expert-Steered ML approach to predict vehicle repair costs from Arabic accident descriptions. The pipeline begins with Arabic text input, undergoes preprocessing, dual feature extraction (semantic + rule-based), ensemble regression, and expert post-processing.</w:t>
+        <w:t>This study adopts a hybrid Expert-Steered Machine Learning approach to automatically predict vehicle repair costs from Arabic accident descriptions. The methodology is designed to address the challenges associated with Arabic text understanding, semantic feature extraction, and domain-calibrated cost estimation in the Saudi automotive insurance context.</w:t>
       </w:r>
     </w:p>
     <w:p>
       <w:pPr>
-        <w:spacing w:before="120" w:after="80"/>
+        <w:spacing w:before="200" w:after="120"/>
         <w:jc w:val="left"/>
       </w:pPr>
       <w:r>
         <w:rPr>
           <w:rFonts w:ascii="Calibri" w:hAnsi="Calibri"/>
           <w:b/>
-          <w:sz w:val="28"/>
+          <w:sz w:val="32"/>
         </w:rPr>
-        <w:t>Data Collection</w:t>
+        <w:t>3.1 Data Collection</w:t>
       </w:r>
     </w:p>
     <w:p>
@@ -3886,21 +3920,7 @@
           <w:i w:val="0"/>
           <w:sz w:val="24"/>
         </w:rPr>
-        <w:t>The dataset combines 100 authentic accident reports from Najm for Insurance Services and 100 damage assessment reports from Taqdeer. Through synthetic augmentation using 15 Arabic templates with location diversification and severity modifiers, the dataset was expanded to 1,066 records, cleaned to 1,000 samples [1][2].</w:t>
-      </w:r>
-    </w:p>
-    <w:p>
-      <w:pPr>
-        <w:spacing w:before="120" w:after="80"/>
-        <w:jc w:val="left"/>
-      </w:pPr>
-      <w:r>
-        <w:rPr>
-          <w:rFonts w:ascii="Calibri" w:hAnsi="Calibri"/>
-          <w:b/>
-          <w:sz w:val="28"/>
-        </w:rPr>
-        <w:t>Preprocessing</w:t>
+        <w:t>The dataset used in this project was collected through a structured data acquisition process combining real-world insurance data with carefully designed synthetic augmentation. The primary data sources consist of 100 authentic accident reports obtained from Najm for Insurance Services and 100 damage assessment reports obtained from Taqdeer [1][2].</w:t>
       </w:r>
     </w:p>
     <w:p>
@@ -3916,12 +3936,26 @@
           <w:i w:val="0"/>
           <w:sz w:val="24"/>
         </w:rPr>
-        <w:t>Data cleaning includes removal of null records, column standardisation, and whitespace normalisation. The dataset was split 80/20 (800 train, 200 test), with the training set further subdivided 90/10 for internal validation (720 train, 80 validation), using random seed 42 for reproducibility.</w:t>
+        <w:t>These 200 real-world records provide a representative sample of actual Arabic accident descriptions and their corresponding repair cost valuations. To enhance diversity, a synthetic data augmentation pipeline was implemented using 15 Arabic accident report templates with location diversification, severity modifiers, and keyword-driven cost assignment. The dataset was expanded to 1,066 records, cleaned to 1,000 high-quality samples.</w:t>
       </w:r>
     </w:p>
     <w:p>
       <w:pPr>
-        <w:spacing w:before="120" w:after="80"/>
+        <w:spacing w:before="200" w:after="120"/>
+        <w:jc w:val="left"/>
+      </w:pPr>
+      <w:r>
+        <w:rPr>
+          <w:rFonts w:ascii="Calibri" w:hAnsi="Calibri"/>
+          <w:b/>
+          <w:sz w:val="32"/>
+        </w:rPr>
+        <w:t>3.2 Preprocessing</w:t>
+      </w:r>
+    </w:p>
+    <w:p>
+      <w:pPr>
+        <w:spacing w:before="160" w:after="80"/>
         <w:jc w:val="left"/>
       </w:pPr>
       <w:r>
@@ -3930,7 +3964,7 @@
           <w:b/>
           <w:sz w:val="28"/>
         </w:rPr>
-        <w:t>Feature Engineering</w:t>
+        <w:t>3.2.1 Data Cleaning</w:t>
       </w:r>
     </w:p>
     <w:p>
@@ -3946,12 +3980,12 @@
           <w:i w:val="0"/>
           <w:sz w:val="24"/>
         </w:rPr>
-        <w:t>The ArabicAccidentFeatureExtractor uses five curated Arabic keyword dictionaries (Very Light, Minor, Moderate, Severe, Critical) plus impact location and 19 vehicle part terms to produce a six-dimensional structured feature vector per text input [4][5].</w:t>
+        <w:t>Data cleaning includes removal of records with missing or null values using dropna(), standardisation of column names, and stripping of leading and trailing whitespace from text entries.</w:t>
       </w:r>
     </w:p>
     <w:p>
       <w:pPr>
-        <w:spacing w:before="120" w:after="80"/>
+        <w:spacing w:before="160" w:after="80"/>
         <w:jc w:val="left"/>
       </w:pPr>
       <w:r>
@@ -3960,7 +3994,7 @@
           <w:b/>
           <w:sz w:val="28"/>
         </w:rPr>
-        <w:t>Embedding Generation</w:t>
+        <w:t>3.2.2 Data Splitting</w:t>
       </w:r>
     </w:p>
     <w:p>
@@ -3976,7 +4010,67 @@
           <w:i w:val="0"/>
           <w:sz w:val="24"/>
         </w:rPr>
-        <w:t>The paraphrase-multilingual-mpnet-base-v2 model (12 transformer layers, 12 attention heads, 50+ languages) generates 768-dimensional dense embeddings. These are concatenated with the 6-dimensional structured features to produce a 774-dimensional hybrid feature vector [9].</w:t>
+        <w:t>The dataset was partitioned 80/20 (800 train, 200 test) with random seed 42. The training set was further subdivided 90/10 (720 training, 80 validation) for internal model comparison. The test set remained entirely unseen during both training and validation.</w:t>
+      </w:r>
+    </w:p>
+    <w:p>
+      <w:pPr>
+        <w:spacing w:before="200" w:after="120"/>
+        <w:jc w:val="left"/>
+      </w:pPr>
+      <w:r>
+        <w:rPr>
+          <w:rFonts w:ascii="Calibri" w:hAnsi="Calibri"/>
+          <w:b/>
+          <w:sz w:val="32"/>
+        </w:rPr>
+        <w:t>3.3 Feature Engineering</w:t>
+      </w:r>
+    </w:p>
+    <w:p>
+      <w:pPr>
+        <w:spacing w:after="160"/>
+        <w:ind w:left="1134"/>
+        <w:jc w:val="both"/>
+      </w:pPr>
+      <w:r>
+        <w:rPr>
+          <w:rFonts w:ascii="Calibri" w:hAnsi="Calibri"/>
+          <w:b w:val="0"/>
+          <w:i w:val="0"/>
+          <w:sz w:val="24"/>
+        </w:rPr>
+        <w:t>A custom Arabic NLP feature extractor (ArabicAccidentFeatureExtractor) uses five curated keyword dictionaries corresponding to damage severity levels: Very Light, Minor, Moderate, Severe, and Critical. Additionally, the extractor identifies impact location (front, rear, side) and counts distinct vehicle parts from a vocabulary of 19 automotive terms. The feature extractor produces a six-dimensional structured vector for ML compatibility [4][5].</w:t>
+      </w:r>
+    </w:p>
+    <w:p>
+      <w:pPr>
+        <w:spacing w:before="200" w:after="120"/>
+        <w:jc w:val="left"/>
+      </w:pPr>
+      <w:r>
+        <w:rPr>
+          <w:rFonts w:ascii="Calibri" w:hAnsi="Calibri"/>
+          <w:b/>
+          <w:sz w:val="32"/>
+        </w:rPr>
+        <w:t>3.4 Embedding Generation</w:t>
+      </w:r>
+    </w:p>
+    <w:p>
+      <w:pPr>
+        <w:spacing w:after="160"/>
+        <w:ind w:left="1134"/>
+        <w:jc w:val="both"/>
+      </w:pPr>
+      <w:r>
+        <w:rPr>
+          <w:rFonts w:ascii="Calibri" w:hAnsi="Calibri"/>
+          <w:b w:val="0"/>
+          <w:i w:val="0"/>
+          <w:sz w:val="24"/>
+        </w:rPr>
+        <w:t>The paraphrase-multilingual-mpnet-base-v2 model (12 transformer encoder layers, 12 attention heads, 50+ languages) generates 768-dimensional dense embedding vectors. These are concatenated with the 6-dimensional structured features via np.hstack() to produce a final 774-dimensional hybrid feature vector. Embedding caching is implemented using joblib serialisation [9].</w:t>
       </w:r>
     </w:p>
     <w:p>
@@ -4007,16 +4101,16 @@
     </w:p>
     <w:p>
       <w:pPr>
-        <w:spacing w:before="120" w:after="80"/>
+        <w:spacing w:before="200" w:after="120"/>
         <w:jc w:val="left"/>
       </w:pPr>
       <w:r>
         <w:rPr>
           <w:rFonts w:ascii="Calibri" w:hAnsi="Calibri"/>
           <w:b/>
-          <w:sz w:val="28"/>
+          <w:sz w:val="32"/>
         </w:rPr>
-        <w:t>Model Training</w:t>
+        <w:t>3.5 Model Training</w:t>
       </w:r>
     </w:p>
     <w:p>
@@ -4032,21 +4126,21 @@
           <w:i w:val="0"/>
           <w:sz w:val="24"/>
         </w:rPr>
-        <w:t>Three regression models are trained on the 774-dimensional vectors: Random Forest Baseline (200 estimators), XGBoost Regressor (200 estimators), and Tuned Random Forest via RandomizedSearchCV (10 iterations, 3-fold CV). The model with the lowest MAE on the validation set is automatically selected and saved [10][11].</w:t>
+        <w:t>Three regression models are trained: Random Forest Baseline (200 estimators), XGBoost Regressor (200 estimators), and Tuned Random Forest via RandomizedSearchCV (10 iterations, 3-fold CV, n_estimators: [100,200,300,500], max_depth: [None,10,20,30]). The model with the lowest MAE on the validation set is automatically selected and saved [10][11].</w:t>
       </w:r>
     </w:p>
     <w:p>
       <w:pPr>
-        <w:spacing w:before="120" w:after="80"/>
+        <w:spacing w:before="200" w:after="120"/>
         <w:jc w:val="left"/>
       </w:pPr>
       <w:r>
         <w:rPr>
           <w:rFonts w:ascii="Calibri" w:hAnsi="Calibri"/>
           <w:b/>
-          <w:sz w:val="28"/>
+          <w:sz w:val="32"/>
         </w:rPr>
-        <w:t>Expert Cost Engine</w:t>
+        <w:t>3.6 Expert Cost Engine</w:t>
       </w:r>
     </w:p>
     <w:p>
@@ -4533,7 +4627,7 @@
           <w:i w:val="0"/>
           <w:sz w:val="24"/>
         </w:rPr>
-        <w:t>The Expert Scaling Logic uses the ML prediction as a relative positioning signal within each tier’s range, adjusted by parts count boost and scratches penalty. A deterministic jitter and ±15% confidence interval are applied to the final output [6][13].</w:t>
+        <w:t>The Expert Scaling Logic uses the ML prediction as a relative positioning signal within each tier’s range, adjusted by a parts count boost (+0.1 per part, max 0.4) and a scratches penalty (-0.3). A deterministic jitter factor (0.95–1.05) and ±15% confidence interval are applied [8][13].</w:t>
       </w:r>
     </w:p>
     <w:p>
@@ -4551,16 +4645,16 @@
     </w:p>
     <w:p>
       <w:pPr>
-        <w:spacing w:before="120" w:after="80"/>
+        <w:spacing w:before="200" w:after="120"/>
         <w:jc w:val="left"/>
       </w:pPr>
       <w:r>
         <w:rPr>
           <w:rFonts w:ascii="Calibri" w:hAnsi="Calibri"/>
           <w:b/>
-          <w:sz w:val="28"/>
+          <w:sz w:val="32"/>
         </w:rPr>
-        <w:t>Web Platform Implementation</w:t>
+        <w:t>3.7 Web Platform Implementation</w:t>
       </w:r>
     </w:p>
     <w:p>
@@ -4576,7 +4670,7 @@
           <w:i w:val="0"/>
           <w:sz w:val="24"/>
         </w:rPr>
-        <w:t>The Streamlit-based web dashboard consists of five pages: Dashboard (KPI cards), Predict Cost (Arabic RTL input), Dataset Explorer, Model Insights, and About. The frontend implements a premium dark theme with custom CSS, glassmorphism effects, and cached model loading via @st.cache_resource.</w:t>
+        <w:t>The Streamlit-based web dashboard consists of five pages: Dashboard (KPI cards with Plotly charts), Predict Cost (Arabic RTL input with 5 quick examples), Dataset Explorer (interactive data tables), Model Insights (pipeline architecture visualisation), and About (project details). The frontend implements a premium dark theme with 611 lines of custom CSS, glassmorphism effects, gradient hero banners, and cached model loading via @st.cache_resource.</w:t>
       </w:r>
     </w:p>
     <w:p>
@@ -4593,6 +4687,7 @@
     </w:p>
     <w:p>
       <w:pPr>
+        <w:spacing w:before="240" w:after="240"/>
         <w:jc w:val="left"/>
       </w:pPr>
       <w:r>
@@ -4606,7 +4701,7 @@
     </w:p>
     <w:p>
       <w:pPr>
-        <w:spacing w:before="160" w:after="120"/>
+        <w:spacing w:before="200" w:after="120"/>
         <w:jc w:val="left"/>
       </w:pPr>
       <w:r>
@@ -4615,21 +4710,7 @@
           <w:b/>
           <w:sz w:val="32"/>
         </w:rPr>
-        <w:t>Testing and Evaluation</w:t>
-      </w:r>
-    </w:p>
-    <w:p>
-      <w:pPr>
-        <w:spacing w:before="120" w:after="80"/>
-        <w:jc w:val="left"/>
-      </w:pPr>
-      <w:r>
-        <w:rPr>
-          <w:rFonts w:ascii="Calibri" w:hAnsi="Calibri"/>
-          <w:b/>
-          <w:sz w:val="28"/>
-        </w:rPr>
-        <w:t>Evaluation Metrics</w:t>
+        <w:t>4.1 Evaluation Metrics</w:t>
       </w:r>
     </w:p>
     <w:p>
@@ -4645,21 +4726,21 @@
           <w:i w:val="0"/>
           <w:sz w:val="24"/>
         </w:rPr>
-        <w:t>Four standard regression metrics were used: Mean Absolute Error (MAE), Root Mean Squared Error (RMSE), R-Squared (R²), and Mean Absolute Percentage Error (MAPE).</w:t>
+        <w:t>Four standard regression metrics were used: Mean Absolute Error (MAE), Root Mean Squared Error (RMSE), R-Squared (R²), and Mean Absolute Percentage Error (MAPE). These metrics capture different aspects of prediction accuracy and are widely used in cost estimation tasks.</w:t>
       </w:r>
     </w:p>
     <w:p>
       <w:pPr>
-        <w:spacing w:before="120" w:after="80"/>
+        <w:spacing w:before="200" w:after="120"/>
         <w:jc w:val="left"/>
       </w:pPr>
       <w:r>
         <w:rPr>
           <w:rFonts w:ascii="Calibri" w:hAnsi="Calibri"/>
           <w:b/>
-          <w:sz w:val="28"/>
+          <w:sz w:val="32"/>
         </w:rPr>
-        <w:t>Model Comparison Results</w:t>
+        <w:t>4.2 Model Comparison Results</w:t>
       </w:r>
     </w:p>
     <w:p>
@@ -4787,6 +4868,22 @@
       </w:tr>
     </w:tbl>
     <w:p/>
+    <w:p>
+      <w:pPr>
+        <w:spacing w:after="160"/>
+        <w:ind w:left="1134"/>
+        <w:jc w:val="both"/>
+      </w:pPr>
+      <w:r>
+        <w:rPr>
+          <w:rFonts w:ascii="Calibri" w:hAnsi="Calibri"/>
+          <w:b w:val="0"/>
+          <w:i w:val="0"/>
+          <w:sz w:val="24"/>
+        </w:rPr>
+        <w:t>The Tuned Random Forest achieved the lowest MAE of 4,661 SAR, improving upon the baseline by approximately 11 percent and outperforming XGBoost by approximately 21 percent.</w:t>
+      </w:r>
+    </w:p>
     <w:p>
       <w:pPr>
         <w:spacing w:after="160"/>
@@ -5144,16 +5241,16 @@
     </w:p>
     <w:p>
       <w:pPr>
-        <w:spacing w:before="120" w:after="80"/>
+        <w:spacing w:before="200" w:after="120"/>
         <w:jc w:val="left"/>
       </w:pPr>
       <w:r>
         <w:rPr>
           <w:rFonts w:ascii="Calibri" w:hAnsi="Calibri"/>
           <w:b/>
-          <w:sz w:val="28"/>
+          <w:sz w:val="32"/>
         </w:rPr>
-        <w:t>Expert Engine Evaluation</w:t>
+        <w:t>4.3 Expert Engine Evaluation</w:t>
       </w:r>
     </w:p>
     <w:p>
@@ -5521,16 +5618,16 @@
     <w:p/>
     <w:p>
       <w:pPr>
-        <w:spacing w:before="120" w:after="80"/>
+        <w:spacing w:before="200" w:after="120"/>
         <w:jc w:val="left"/>
       </w:pPr>
       <w:r>
         <w:rPr>
           <w:rFonts w:ascii="Calibri" w:hAnsi="Calibri"/>
           <w:b/>
-          <w:sz w:val="28"/>
+          <w:sz w:val="32"/>
         </w:rPr>
-        <w:t>Web Platform Functional Testing</w:t>
+        <w:t>4.4 Web Platform Functional Testing</w:t>
       </w:r>
     </w:p>
     <w:p>
@@ -5546,7 +5643,7 @@
           <w:i w:val="0"/>
           <w:sz w:val="24"/>
         </w:rPr>
-        <w:t>The platform was tested for Arabic RTL text input, quick example buttons, real-time prediction, severity badges, confidence intervals, model metrics visualisation, interactive Plotly charts, and responsive layout.</w:t>
+        <w:t>The platform was functionally tested to verify integration of all system components. Testing covered Arabic text input handling with RTL support, quick example button functionality, real-time prediction execution, severity badge and confidence interval display, model metrics loading and visualisation, dataset exploration with interactive Plotly charts, and responsive layout across different screen sizes.</w:t>
       </w:r>
     </w:p>
     <w:p>
@@ -5563,6 +5660,7 @@
     </w:p>
     <w:p>
       <w:pPr>
+        <w:spacing w:before="240" w:after="240"/>
         <w:jc w:val="left"/>
       </w:pPr>
       <w:r>
@@ -5576,7 +5674,7 @@
     </w:p>
     <w:p>
       <w:pPr>
-        <w:spacing w:before="160" w:after="120"/>
+        <w:spacing w:before="200" w:after="120"/>
         <w:jc w:val="left"/>
       </w:pPr>
       <w:r>
@@ -5585,21 +5683,7 @@
           <w:b/>
           <w:sz w:val="32"/>
         </w:rPr>
-        <w:t>Results and Discussion</w:t>
-      </w:r>
-    </w:p>
-    <w:p>
-      <w:pPr>
-        <w:spacing w:before="120" w:after="80"/>
-        <w:jc w:val="left"/>
-      </w:pPr>
-      <w:r>
-        <w:rPr>
-          <w:rFonts w:ascii="Calibri" w:hAnsi="Calibri"/>
-          <w:b/>
-          <w:sz w:val="28"/>
-        </w:rPr>
-        <w:t>Key Findings</w:t>
+        <w:t>5.1 Key Findings</w:t>
       </w:r>
     </w:p>
     <w:p>
@@ -5615,21 +5699,7 @@
           <w:i w:val="0"/>
           <w:sz w:val="24"/>
         </w:rPr>
-        <w:t>The hybrid pipeline achieved an R² of 0.856, indicating that it explains approximately 85.6 percent of the variance in actual repair costs. The MAE of 4,661 SAR represents a reasonable average prediction error. The most significant finding is the 141-fold dynamic range (311–43,946 SAR) achieved after expert engine integration, representing a 47-fold improvement over the pre-expert baseline which exhibited only a 3-fold range.</w:t>
-      </w:r>
-    </w:p>
-    <w:p>
-      <w:pPr>
-        <w:spacing w:before="120" w:after="80"/>
-        <w:jc w:val="left"/>
-      </w:pPr>
-      <w:r>
-        <w:rPr>
-          <w:rFonts w:ascii="Calibri" w:hAnsi="Calibri"/>
-          <w:b/>
-          <w:sz w:val="28"/>
-        </w:rPr>
-        <w:t>Practical Implications</w:t>
+        <w:t>The results demonstrate the effectiveness of integrating Transformer-based semantic embeddings, ensemble machine learning regression, and domain-calibrated expert reasoning within a unified pipeline. The system achieved an R² of 0.856 on the held-out test set, indicating that the system explains approximately 85.6 percent of the variance in actual repair costs. The MAE of 4,661 SAR represents a reasonable average prediction error given the inherently noisy nature of insurance cost data.</w:t>
       </w:r>
     </w:p>
     <w:p>
@@ -5645,21 +5715,21 @@
           <w:i w:val="0"/>
           <w:sz w:val="24"/>
         </w:rPr>
-        <w:t>The interactive dashboard provides insurance professionals with an accessible tool for real-time cost prediction, enabling rapid preliminary assessment of incoming claims. The system’s transparency through severity classification, detected features, and confidence intervals supports informed decision-making.</w:t>
+        <w:t>The most significant finding is the dramatic improvement in prediction granularity achieved by the Expert Cost Engine. Before expert engine integration, the ML model exhibited a bucketing bias, returning approximately 6,000 SAR for all minor incidents and approximately 18,000 SAR for all moderate-to-severe cases, resulting in only a 3-fold dynamic range. After expert engine integration, the system achieves a 141-fold dynamic range (311 SAR to 43,946 SAR), representing a 47-fold improvement in granularity.</w:t>
       </w:r>
     </w:p>
     <w:p>
       <w:pPr>
-        <w:spacing w:before="120" w:after="80"/>
+        <w:spacing w:before="200" w:after="120"/>
         <w:jc w:val="left"/>
       </w:pPr>
       <w:r>
         <w:rPr>
           <w:rFonts w:ascii="Calibri" w:hAnsi="Calibri"/>
           <w:b/>
-          <w:sz w:val="28"/>
+          <w:sz w:val="32"/>
         </w:rPr>
-        <w:t>Comparison with Existing Systems</w:t>
+        <w:t>5.2 Practical Implications</w:t>
       </w:r>
     </w:p>
     <w:p>
@@ -5675,21 +5745,21 @@
           <w:i w:val="0"/>
           <w:sz w:val="24"/>
         </w:rPr>
-        <w:t>Unlike conventional NLP-based claims processing [8], SmartClaim AI extends beyond classification to provide granular numerical cost estimates. The Expert Cost Engine ensures predictions reflect domain-specific pricing structures, distinguishing this work from general-purpose regression approaches [10][11].</w:t>
+        <w:t>The interactive web dashboard provides insurance professionals with an accessible and user-friendly tool for real-time cost prediction. The system’s ability to provide transparency through severity classification, detected features, and confidence intervals alongside each prediction supports informed decision-making and aligns with the insurance industry’s requirements for explainable and auditable assessment processes.</w:t>
       </w:r>
     </w:p>
     <w:p>
       <w:pPr>
-        <w:spacing w:before="120" w:after="80"/>
+        <w:spacing w:before="200" w:after="120"/>
         <w:jc w:val="left"/>
       </w:pPr>
       <w:r>
         <w:rPr>
           <w:rFonts w:ascii="Calibri" w:hAnsi="Calibri"/>
           <w:b/>
-          <w:sz w:val="28"/>
+          <w:sz w:val="32"/>
         </w:rPr>
-        <w:t>Challenges and Limitations</w:t>
+        <w:t>5.3 Comparison with Existing Systems</w:t>
       </w:r>
     </w:p>
     <w:p>
@@ -5705,37 +5775,7 @@
           <w:i w:val="0"/>
           <w:sz w:val="24"/>
         </w:rPr>
-        <w:t>Key challenges include limited dataset size (200 authentic records requiring synthetic augmentation), Arabic dialect processing complexity, expert engine calibration to Saudi market pricing, and the bucketing bias mitigation challenge. Limitations include text-only analysis (no image input), static expert rules requiring periodic recalibration, and elevated MAPE (64.2%) for extreme cost scenarios.</w:t>
-      </w:r>
-    </w:p>
-    <w:p>
-      <w:pPr>
-        <w:spacing w:before="120" w:after="80"/>
-        <w:jc w:val="left"/>
-      </w:pPr>
-      <w:r>
-        <w:rPr>
-          <w:rFonts w:ascii="Calibri" w:hAnsi="Calibri"/>
-          <w:b/>
-          <w:sz w:val="28"/>
-        </w:rPr>
-        <w:t>Ethical Considerations</w:t>
-      </w:r>
-    </w:p>
-    <w:p>
-      <w:pPr>
-        <w:spacing w:after="160"/>
-        <w:ind w:left="1134"/>
-        <w:jc w:val="both"/>
-      </w:pPr>
-      <w:r>
-        <w:rPr>
-          <w:rFonts w:ascii="Calibri" w:hAnsi="Calibri"/>
-          <w:b w:val="0"/>
-          <w:i w:val="0"/>
-          <w:sz w:val="24"/>
-        </w:rPr>
-        <w:t>SmartClaim AI is designed as a decision-support tool, not a replacement for human expertise. Data privacy is maintained as no personally identifiable information is used. Transparency is provided through severity tiers, detected features, and confidence intervals. Ongoing evaluation is necessary to ensure fairness across diverse description styles.</w:t>
+        <w:t>Compared with conventional NLP-based claims processing approaches [8], the proposed system extends beyond text classification to provide granular numerical cost estimates calibrated to the Saudi automotive repair market. Unlike general-purpose regression models [10][11], the Expert Cost Engine ensures that predictions reflect domain-specific pricing structures and severity distinctions. A distinguishing aspect is the focus on Arabic-language processing in the insurance domain, an area largely underexplored in existing literature [4][12].</w:t>
       </w:r>
     </w:p>
     <w:p>
@@ -5759,14 +5799,128 @@
         <w:rPr>
           <w:rFonts w:ascii="Calibri" w:hAnsi="Calibri"/>
           <w:b/>
-          <w:sz w:val="50"/>
+          <w:sz w:val="48"/>
         </w:rPr>
-        <w:t>Conclusion and Future Work</w:t>
+        <w:t>06    Challenges and Limitations</w:t>
       </w:r>
     </w:p>
     <w:p>
       <w:pPr>
-        <w:spacing w:before="120" w:after="80"/>
+        <w:spacing w:after="160"/>
+        <w:ind w:left="1134"/>
+        <w:jc w:val="both"/>
+      </w:pPr>
+      <w:r>
+        <w:rPr>
+          <w:rFonts w:ascii="Calibri" w:hAnsi="Calibri"/>
+          <w:b w:val="0"/>
+          <w:i w:val="0"/>
+          <w:sz w:val="24"/>
+        </w:rPr>
+        <w:t>The development of SmartClaim AI involved several technical and research challenges. Data acquisition was constrained by the sensitivity of insurance data and privacy regulations, limiting the available authentic records to 200. Arabic text processing presented unique linguistic challenges, as Saudi accident reports frequently mix Modern Standard Arabic with regional dialectal terms for vehicle parts. Calibrating the seven-tier Expert Cost Engine required extensive domain research and iterative refinement.</w:t>
+      </w:r>
+    </w:p>
+    <w:p>
+      <w:pPr>
+        <w:spacing w:after="160"/>
+        <w:ind w:left="1134"/>
+        <w:jc w:val="both"/>
+      </w:pPr>
+      <w:r>
+        <w:rPr>
+          <w:rFonts w:ascii="Calibri" w:hAnsi="Calibri"/>
+          <w:b w:val="0"/>
+          <w:i w:val="0"/>
+          <w:sz w:val="24"/>
+        </w:rPr>
+        <w:t>Limitations include the relatively small dataset (200 authentic records requiring synthetic augmentation), text-only analysis without image input, static expert rules requiring periodic manual recalibration, and elevated MAPE (64.2%) for extreme cost scenarios.</w:t>
+      </w:r>
+    </w:p>
+    <w:p>
+      <w:pPr>
+        <w:sectPr>
+          <w:pgSz w:w="12240" w:h="15840"/>
+          <w:pgMar w:top="1440" w:right="567" w:bottom="1134" w:left="567" w:header="720" w:footer="720" w:gutter="0"/>
+          <w:cols w:space="720"/>
+          <w:docGrid w:linePitch="360"/>
+          <w:pgNumType w:fmt="decimal" w:start="1"/>
+        </w:sectPr>
+      </w:pPr>
+    </w:p>
+    <w:p>
+      <w:pPr>
+        <w:spacing w:before="240" w:after="240"/>
+        <w:jc w:val="left"/>
+      </w:pPr>
+      <w:r>
+        <w:rPr>
+          <w:rFonts w:ascii="Calibri" w:hAnsi="Calibri"/>
+          <w:b/>
+          <w:sz w:val="48"/>
+        </w:rPr>
+        <w:t>07    Ethical Considerations</w:t>
+      </w:r>
+    </w:p>
+    <w:p>
+      <w:pPr>
+        <w:spacing w:after="160"/>
+        <w:ind w:left="1134"/>
+        <w:jc w:val="both"/>
+      </w:pPr>
+      <w:r>
+        <w:rPr>
+          <w:rFonts w:ascii="Calibri" w:hAnsi="Calibri"/>
+          <w:b w:val="0"/>
+          <w:i w:val="0"/>
+          <w:sz w:val="24"/>
+        </w:rPr>
+        <w:t>SmartClaim AI was developed as a decision-support tool intended to assist insurance professionals rather than replace human expertise. The predicted costs should be considered supportive information that assists the claims assessment process. Final cost determination should remain under the supervision of qualified insurance adjusters and regulatory authorities.</w:t>
+      </w:r>
+    </w:p>
+    <w:p>
+      <w:pPr>
+        <w:spacing w:after="160"/>
+        <w:ind w:left="1134"/>
+        <w:jc w:val="both"/>
+      </w:pPr>
+      <w:r>
+        <w:rPr>
+          <w:rFonts w:ascii="Calibri" w:hAnsi="Calibri"/>
+          <w:b w:val="0"/>
+          <w:i w:val="0"/>
+          <w:sz w:val="24"/>
+        </w:rPr>
+        <w:t>The dataset does not contain personally identifiable information. Transparency is provided through severity tier classification, detected features display, and confidence intervals. The Expert Cost Engine mitigates some forms of bias by constraining predictions within domain-calibrated ranges. However, the system’s reliance on keyword-based feature extraction may introduce linguistic biases. Ongoing evaluation is necessary to ensure fairness across diverse description styles.</w:t>
+      </w:r>
+    </w:p>
+    <w:p>
+      <w:pPr>
+        <w:sectPr>
+          <w:pgSz w:w="12240" w:h="15840"/>
+          <w:pgMar w:top="1440" w:right="567" w:bottom="1134" w:left="567" w:header="720" w:footer="720" w:gutter="0"/>
+          <w:cols w:space="720"/>
+          <w:docGrid w:linePitch="360"/>
+          <w:pgNumType w:fmt="decimal" w:start="1"/>
+        </w:sectPr>
+      </w:pPr>
+    </w:p>
+    <w:p>
+      <w:pPr>
+        <w:spacing w:before="240" w:after="240"/>
+        <w:jc w:val="left"/>
+      </w:pPr>
+      <w:r>
+        <w:rPr>
+          <w:rFonts w:ascii="Calibri" w:hAnsi="Calibri"/>
+          <w:b/>
+          <w:sz w:val="48"/>
+        </w:rPr>
+        <w:t>08    Conclusion and Future Work</w:t>
+      </w:r>
+    </w:p>
+    <w:p>
+      <w:pPr>
+        <w:spacing w:before="160" w:after="80"/>
         <w:jc w:val="left"/>
       </w:pPr>
       <w:r>
@@ -5791,7 +5945,7 @@
           <w:i w:val="0"/>
           <w:sz w:val="24"/>
         </w:rPr>
-        <w:t>This project presented SmartClaim AI, an integrated hybrid pipeline for intelligent prediction of vehicle repair costs from Arabic accident descriptions. The system combines a multilingual Sentence Transformer, custom Arabic NLP feature extraction, ensemble regression with hyperparameter optimisation, and a seven-tier Expert Cost Engine — all delivered through a premium Streamlit dashboard.</w:t>
+        <w:t>This project presented SmartClaim AI, an integrated hybrid pipeline for intelligent prediction of vehicle repair costs from Arabic accident descriptions. The system combines a paraphrase-multilingual-mpnet-base-v2 Sentence Transformer for 768-dimensional semantic embedding, a custom Arabic NLP feature extraction engine, ensemble regression models with hyperparameter optimisation, and a seven-tier Expert Cost Engine with domain-calibrated Saudi Riyal ranges — all delivered through a premium Streamlit-based web dashboard.</w:t>
       </w:r>
     </w:p>
     <w:p>
@@ -5807,12 +5961,12 @@
           <w:i w:val="0"/>
           <w:sz w:val="24"/>
         </w:rPr>
-        <w:t>The evaluation demonstrated R² = 0.856, MAE = 4,661 SAR, and a 141-fold dynamic prediction range with a 47-fold granularity improvement, validating the Expert-Steered ML paradigm.</w:t>
+        <w:t>The evaluation demonstrated R² = 0.856, MAE = 4,661 SAR, and a dynamic prediction range of 311 SAR to 43,946 SAR (141-fold range), with a 47-fold improvement in granularity, validating the Expert-Steered ML paradigm.</w:t>
       </w:r>
     </w:p>
     <w:p>
       <w:pPr>
-        <w:spacing w:before="120" w:after="80"/>
+        <w:spacing w:before="160" w:after="80"/>
         <w:jc w:val="left"/>
       </w:pPr>
       <w:r>
@@ -5837,7 +5991,135 @@
           <w:i w:val="0"/>
           <w:sz w:val="24"/>
         </w:rPr>
-        <w:t>Future directions include: expanding the dataset with additional authentic records, incorporating image-based damage detection for multimodal assessment, transitioning to adaptive expert rules that learn from incoming claims data, integrating Arabic-specific language models (AraBERT/CAMeL-BERT), incorporating RAG techniques for natural language explanations, developing expert-in-the-loop feedback mechanisms, integrating with insurance management systems via APIs, and aligning with Saudi Vision 2030 InsurTech programmes.</w:t>
+        <w:t>First, the training dataset can be expanded by obtaining additional authentic accident reports from Saudi insurance providers across a broader range of vehicle types, damage scenarios, and regional pricing variations.</w:t>
+      </w:r>
+    </w:p>
+    <w:p>
+      <w:pPr>
+        <w:spacing w:after="160"/>
+        <w:ind w:left="1134"/>
+        <w:jc w:val="both"/>
+      </w:pPr>
+      <w:r>
+        <w:rPr>
+          <w:rFonts w:ascii="Calibri" w:hAnsi="Calibri"/>
+          <w:b w:val="0"/>
+          <w:i w:val="0"/>
+          <w:sz w:val="24"/>
+        </w:rPr>
+        <w:t>Second, future versions may incorporate image-based damage detection alongside textual analysis, creating a multimodal assessment pipeline that combines visual inspection with text understanding.</w:t>
+      </w:r>
+    </w:p>
+    <w:p>
+      <w:pPr>
+        <w:spacing w:after="160"/>
+        <w:ind w:left="1134"/>
+        <w:jc w:val="both"/>
+      </w:pPr>
+      <w:r>
+        <w:rPr>
+          <w:rFonts w:ascii="Calibri" w:hAnsi="Calibri"/>
+          <w:b w:val="0"/>
+          <w:i w:val="0"/>
+          <w:sz w:val="24"/>
+        </w:rPr>
+        <w:t>Third, transitioning the Expert Cost Engine from static rules to a dynamically adaptive system that learns from incoming claims data would improve long-term accuracy.</w:t>
+      </w:r>
+    </w:p>
+    <w:p>
+      <w:pPr>
+        <w:spacing w:after="160"/>
+        <w:ind w:left="1134"/>
+        <w:jc w:val="both"/>
+      </w:pPr>
+      <w:r>
+        <w:rPr>
+          <w:rFonts w:ascii="Calibri" w:hAnsi="Calibri"/>
+          <w:b w:val="0"/>
+          <w:i w:val="0"/>
+          <w:sz w:val="24"/>
+        </w:rPr>
+        <w:t>Fourth, integrating Arabic dialect-specific language models such as AraBERT or CAMeL-BERT fine-tuned on Saudi insurance corpus data could improve semantic understanding.</w:t>
+      </w:r>
+    </w:p>
+    <w:p>
+      <w:pPr>
+        <w:spacing w:after="160"/>
+        <w:ind w:left="1134"/>
+        <w:jc w:val="both"/>
+      </w:pPr>
+      <w:r>
+        <w:rPr>
+          <w:rFonts w:ascii="Calibri" w:hAnsi="Calibri"/>
+          <w:b w:val="0"/>
+          <w:i w:val="0"/>
+          <w:sz w:val="24"/>
+        </w:rPr>
+        <w:t>Fifth, incorporating Retrieval-Augmented Generation (RAG) techniques for generating natural language explanations of cost predictions represents a promising direction.</w:t>
+      </w:r>
+    </w:p>
+    <w:p>
+      <w:pPr>
+        <w:spacing w:after="160"/>
+        <w:ind w:left="1134"/>
+        <w:jc w:val="both"/>
+      </w:pPr>
+      <w:r>
+        <w:rPr>
+          <w:rFonts w:ascii="Calibri" w:hAnsi="Calibri"/>
+          <w:b w:val="0"/>
+          <w:i w:val="0"/>
+          <w:sz w:val="24"/>
+        </w:rPr>
+        <w:t>Sixth, structured feedback mechanisms can be developed to allow insurance adjusters to review and refine system predictions, supporting continuous learning.</w:t>
+      </w:r>
+    </w:p>
+    <w:p>
+      <w:pPr>
+        <w:spacing w:after="160"/>
+        <w:ind w:left="1134"/>
+        <w:jc w:val="both"/>
+      </w:pPr>
+      <w:r>
+        <w:rPr>
+          <w:rFonts w:ascii="Calibri" w:hAnsi="Calibri"/>
+          <w:b w:val="0"/>
+          <w:i w:val="0"/>
+          <w:sz w:val="24"/>
+        </w:rPr>
+        <w:t>Seventh, expanding the platform to integrate with existing insurance management systems through standardised APIs would enable seamless deployment within production workflows.</w:t>
+      </w:r>
+    </w:p>
+    <w:p>
+      <w:pPr>
+        <w:spacing w:after="160"/>
+        <w:ind w:left="1134"/>
+        <w:jc w:val="both"/>
+      </w:pPr>
+      <w:r>
+        <w:rPr>
+          <w:rFonts w:ascii="Calibri" w:hAnsi="Calibri"/>
+          <w:b w:val="0"/>
+          <w:i w:val="0"/>
+          <w:sz w:val="24"/>
+        </w:rPr>
+        <w:t>Eighth, future versions could be aligned with national digital transformation initiatives and InsurTech programmes, contributing to the modernisation objectives outlined in Saudi Vision 2030.</w:t>
+      </w:r>
+    </w:p>
+    <w:p>
+      <w:pPr>
+        <w:spacing w:after="160"/>
+        <w:ind w:left="1134"/>
+        <w:jc w:val="both"/>
+      </w:pPr>
+      <w:r>
+        <w:rPr>
+          <w:rFonts w:ascii="Calibri" w:hAnsi="Calibri"/>
+          <w:b w:val="0"/>
+          <w:i w:val="0"/>
+          <w:sz w:val="24"/>
+        </w:rPr>
+        <w:t>Finally, reducing computational overhead through model distillation and optimised embedding caching would improve deployment feasibility in resource-constrained environments.</w:t>
       </w:r>
     </w:p>
     <w:p>
@@ -5860,9 +6142,9 @@
         <w:rPr>
           <w:rFonts w:ascii="Calibri" w:hAnsi="Calibri"/>
           <w:b/>
-          <w:sz w:val="50"/>
+          <w:sz w:val="48"/>
         </w:rPr>
-        <w:t>References</w:t>
+        <w:t>09    References</w:t>
       </w:r>
     </w:p>
     <w:p>
@@ -5876,7 +6158,7 @@
           <w:rFonts w:ascii="Calibri" w:hAnsi="Calibri"/>
           <w:sz w:val="22"/>
         </w:rPr>
-        <w:t>[1] Najm for Insurance Services, "About Najm," 2024. [Online]. Available: https://www.najm.sa/en/about-najm.</w:t>
+        <w:t>[1] Najm for Insurance Services, "About Najm," 2024. [Online]. Available: https://www.najm.sa/en/about-najm. [Accessed: Apr. 7, 2026].</w:t>
       </w:r>
     </w:p>
     <w:p>
@@ -5890,7 +6172,7 @@
           <w:rFonts w:ascii="Calibri" w:hAnsi="Calibri"/>
           <w:sz w:val="22"/>
         </w:rPr>
-        <w:t>[2] Saudi Central Bank (SAMA), "Taqdeer: Vehicle Damage Estimation," 2023. [Online]. Available: https://www.sama.gov.sa.</w:t>
+        <w:t>[2] Saudi Central Bank (SAMA), "Taqdeer: Vehicle Damage Estimation," 2023. [Online]. Available: https://www.sama.gov.sa. [Accessed: Apr. 7, 2026].</w:t>
       </w:r>
     </w:p>
     <w:p>
@@ -5946,7 +6228,7 @@
           <w:rFonts w:ascii="Calibri" w:hAnsi="Calibri"/>
           <w:sz w:val="22"/>
         </w:rPr>
-        <w:t>[6] P. Hartmann, "Machine Learning in Insurance: Challenges and Opportunities," J. Financial Technology, vol. 3, no. 1, pp. 28–42, 2022.</w:t>
+        <w:t>[6] J. Devlin, M.-W. Chang, K. Lee, and K. Toutanova, "BERT: Pre-training of Deep Bidirectional Transformers for Language Understanding," in Proc. NAACL-HLT, 2019, pp. 4171–4186.</w:t>
       </w:r>
     </w:p>
     <w:p>
@@ -5960,7 +6242,7 @@
           <w:rFonts w:ascii="Calibri" w:hAnsi="Calibri"/>
           <w:sz w:val="22"/>
         </w:rPr>
-        <w:t>[7] Saudi Vision 2030, "Financial Sector Development Program," 2016. [Online]. Available: https://www.vision2030.gov.sa.</w:t>
+        <w:t>[7] T. Wolf et al., "Transformers: State-of-the-Art Natural Language Processing," in Proc. EMNLP: System Demonstrations, 2020, pp. 38–45.</w:t>
       </w:r>
     </w:p>
     <w:p>
@@ -5974,7 +6256,7 @@
           <w:rFonts w:ascii="Calibri" w:hAnsi="Calibri"/>
           <w:sz w:val="22"/>
         </w:rPr>
-        <w:t>[8] A. Ly, M. Uthayasooriyar, and T. Wang, "A Survey on NLP and Applications in Insurance," arXiv:2010.00462, 2020.</w:t>
+        <w:t>[8] A. Ly, M. Uthayasooriyar, and T. Wang, "A Survey on Natural Language Processing (NLP) and Applications in Insurance," arXiv preprint arXiv:2010.00462, 2020.</w:t>
       </w:r>
     </w:p>
     <w:p>
@@ -6002,7 +6284,7 @@
           <w:rFonts w:ascii="Calibri" w:hAnsi="Calibri"/>
           <w:sz w:val="22"/>
         </w:rPr>
-        <w:t>[10] T. Chen and C. Guestrin, "XGBoost: A Scalable Tree Boosting System," in Proc. ACM SIGKDD, 2016, pp. 785–794.</w:t>
+        <w:t>[10] T. Chen and C. Guestrin, "XGBoost: A Scalable Tree Boosting System," in Proc. 22nd ACM SIGKDD Int. Conf. KDD, 2016, pp. 785–794.</w:t>
       </w:r>
     </w:p>
     <w:p>
@@ -6030,7 +6312,7 @@
           <w:rFonts w:ascii="Calibri" w:hAnsi="Calibri"/>
           <w:sz w:val="22"/>
         </w:rPr>
-        <w:t>[12] W. Antoun, F. Baly, and H. Hajj, "AraBERT: Transformer-based Model for Arabic Language Understanding," in Proc. 4th Workshop OSACT, 2020, pp. 9–15.</w:t>
+        <w:t>[12] W. Antoun, F. Baly, and H. Hajj, "AraBERT: Transformer-based Model for Arabic Language Understanding," in Proc. 4th Workshop on Open-Source Arabic Corpora, 2020, pp. 9–15.</w:t>
       </w:r>
     </w:p>
     <w:p>
@@ -6044,7 +6326,7 @@
           <w:rFonts w:ascii="Calibri" w:hAnsi="Calibri"/>
           <w:sz w:val="22"/>
         </w:rPr>
-        <w:t>[13] S. Soni, R. Vyas, and P. Jain, "AI and Expert System in Insurance Industry," Int. J. Soft Computing, vol. 6, no. 1, pp. 1–6, 2011.</w:t>
+        <w:t>[13] S. Soni, R. Vyas, and P. Jain, "Artificial Intelligence and Expert System in Insurance Industry," Int. J. Soft Computing, vol. 6, no. 1, pp. 1–6, 2011.</w:t>
       </w:r>
     </w:p>
     <w:p>
@@ -6058,7 +6340,7 @@
           <w:rFonts w:ascii="Calibri" w:hAnsi="Calibri"/>
           <w:sz w:val="22"/>
         </w:rPr>
-        <w:t>[14] N. Dhieb et al., "A Secure AI-Driven Architecture for Automated Insurance Claims Processing," in Proc. 62nd IEEE MWSCAS, 2019.</w:t>
+        <w:t>[14] N. Dhieb, H. Ghazzai, H. Besber, and Y. Massoud, "A Secure AI-Driven Architecture for Automated Insurance Claims Processing," in Proc. 62nd IEEE MWSCAS, 2019, pp. 1–4.</w:t>
       </w:r>
     </w:p>
     <w:p>
@@ -6081,14 +6363,14 @@
         <w:rPr>
           <w:rFonts w:ascii="Calibri" w:hAnsi="Calibri"/>
           <w:b/>
-          <w:sz w:val="50"/>
+          <w:sz w:val="48"/>
         </w:rPr>
-        <w:t>Appendices</w:t>
+        <w:t>10    Appendices</w:t>
       </w:r>
     </w:p>
     <w:p>
       <w:pPr>
-        <w:spacing w:before="120" w:after="80"/>
+        <w:spacing w:before="160" w:after="80"/>
         <w:jc w:val="left"/>
       </w:pPr>
       <w:r>
@@ -6097,7 +6379,7 @@
           <w:b/>
           <w:sz w:val="28"/>
         </w:rPr>
-        <w:t>Appendix A: Web Platform Interfaces</w:t>
+        <w:t>Appendix A: Additional Web Platform Interfaces</w:t>
       </w:r>
     </w:p>
     <w:p>
@@ -6141,7 +6423,7 @@
     </w:p>
     <w:p>
       <w:pPr>
-        <w:spacing w:before="120" w:after="80"/>
+        <w:spacing w:before="160" w:after="80"/>
         <w:jc w:val="left"/>
       </w:pPr>
       <w:r>

</xml_diff>